<commit_message>
Add clean src-layout for explainable image ambiguity prediction.
Introduce the image_ambiguity package with config, logging, utils, and COCO loader; add FastAPI backend scaffold, env/YAML configs, tests, and project docs.

Co-authored-by: Cursor <cursoragent@cursor.com>
</commit_message>
<xml_diff>
--- a/myDocs/step.docx
+++ b/myDocs/step.docx
@@ -4,13 +4,8 @@
   <w:body>
     <w:p>
       <w:r>
-        <w:t xml:space="preserve">import </w:t>
-      </w:r>
-      <w:proofErr w:type="spellStart"/>
-      <w:r>
-        <w:t>json</w:t>
-      </w:r>
-      <w:proofErr w:type="spellEnd"/>
+        <w:t>import json</w:t>
+      </w:r>
     </w:p>
     <w:p>
       <w:r>
@@ -23,31 +18,13 @@
       </w:r>
     </w:p>
     <w:p>
-      <w:proofErr w:type="spellStart"/>
-      <w:r>
-        <w:t>anns</w:t>
-      </w:r>
-      <w:proofErr w:type="spellEnd"/>
-      <w:r>
-        <w:t xml:space="preserve"> = </w:t>
-      </w:r>
-      <w:proofErr w:type="spellStart"/>
-      <w:r>
-        <w:t>json.load</w:t>
-      </w:r>
-      <w:proofErr w:type="spellEnd"/>
-      <w:r>
-        <w:t>(file)</w:t>
-      </w:r>
-    </w:p>
-    <w:p>
-      <w:proofErr w:type="spellStart"/>
-      <w:r>
-        <w:t>anns.keys</w:t>
-      </w:r>
-      <w:proofErr w:type="spellEnd"/>
-      <w:r>
-        <w:t>()</w:t>
+      <w:r>
+        <w:t>anns = json.load(file)</w:t>
+      </w:r>
+    </w:p>
+    <w:p>
+      <w:r>
+        <w:t>anns.keys()</w:t>
       </w:r>
     </w:p>
     <w:p/>
@@ -73,102 +50,43 @@
     </w:p>
     <w:p>
       <w:r>
-        <w:t xml:space="preserve">import </w:t>
-      </w:r>
-      <w:proofErr w:type="spellStart"/>
-      <w:r>
-        <w:t>json</w:t>
-      </w:r>
-      <w:proofErr w:type="spellEnd"/>
+        <w:t>import json</w:t>
+      </w:r>
+    </w:p>
+    <w:p>
+      <w:r>
+        <w:t>path = './dataset/annotations/captions_val2017.json'</w:t>
+      </w:r>
+    </w:p>
+    <w:p>
+      <w:r>
+        <w:t>with open(path) as file:</w:t>
+      </w:r>
+    </w:p>
+    <w:p>
+      <w:r>
+        <w:t xml:space="preserve">    caps = json.load(file)</w:t>
+      </w:r>
     </w:p>
     <w:p/>
     <w:p>
       <w:r>
-        <w:t>path = './dataset/annotations/captions_val2017.json'</w:t>
-      </w:r>
-    </w:p>
-    <w:p>
-      <w:r>
-        <w:t>with open(path) as file:</w:t>
-      </w:r>
-    </w:p>
-    <w:p>
-      <w:r>
-        <w:t xml:space="preserve">    caps = </w:t>
-      </w:r>
-      <w:proofErr w:type="spellStart"/>
-      <w:r>
-        <w:t>json.load</w:t>
-      </w:r>
-      <w:proofErr w:type="spellEnd"/>
-      <w:r>
-        <w:t>(file)</w:t>
-      </w:r>
-    </w:p>
-    <w:p/>
-    <w:p>
-      <w:proofErr w:type="spellStart"/>
-      <w:r>
-        <w:t>image_id</w:t>
-      </w:r>
-      <w:proofErr w:type="spellEnd"/>
-      <w:r>
-        <w:t xml:space="preserve"> = 397133</w:t>
-      </w:r>
-    </w:p>
-    <w:p>
-      <w:r>
-        <w:t xml:space="preserve">for </w:t>
-      </w:r>
-      <w:proofErr w:type="spellStart"/>
-      <w:r>
-        <w:t>ann</w:t>
-      </w:r>
-      <w:proofErr w:type="spellEnd"/>
-      <w:r>
-        <w:t xml:space="preserve"> in caps['annotations']:</w:t>
-      </w:r>
-    </w:p>
-    <w:p>
-      <w:r>
-        <w:t xml:space="preserve">    if </w:t>
-      </w:r>
-      <w:proofErr w:type="spellStart"/>
-      <w:r>
-        <w:t>ann</w:t>
-      </w:r>
-      <w:proofErr w:type="spellEnd"/>
-      <w:r>
-        <w:t>['</w:t>
-      </w:r>
-      <w:proofErr w:type="spellStart"/>
-      <w:r>
-        <w:t>image_id</w:t>
-      </w:r>
-      <w:proofErr w:type="spellEnd"/>
-      <w:r>
-        <w:t xml:space="preserve">'] == </w:t>
-      </w:r>
-      <w:proofErr w:type="spellStart"/>
-      <w:r>
-        <w:t>image_id</w:t>
-      </w:r>
-      <w:proofErr w:type="spellEnd"/>
-      <w:r>
-        <w:t>:</w:t>
-      </w:r>
-    </w:p>
-    <w:p>
-      <w:r>
-        <w:t xml:space="preserve">        print(</w:t>
-      </w:r>
-      <w:proofErr w:type="spellStart"/>
-      <w:r>
-        <w:t>ann</w:t>
-      </w:r>
-      <w:proofErr w:type="spellEnd"/>
-      <w:r>
-        <w:t>['caption'])</w:t>
+        <w:t>image_id = 397133</w:t>
+      </w:r>
+    </w:p>
+    <w:p>
+      <w:r>
+        <w:t>for ann in caps['annotations']:</w:t>
+      </w:r>
+    </w:p>
+    <w:p>
+      <w:r>
+        <w:t xml:space="preserve">    if ann['image_id'] == image_id:</w:t>
+      </w:r>
+    </w:p>
+    <w:p>
+      <w:r>
+        <w:t xml:space="preserve">        print(ann['caption'])</w:t>
       </w:r>
     </w:p>
     <w:p/>
@@ -212,97 +130,43 @@
     </w:p>
     <w:p>
       <w:r>
-        <w:t xml:space="preserve">import </w:t>
-      </w:r>
-      <w:proofErr w:type="spellStart"/>
-      <w:r>
-        <w:t>matplotlib.pyplot</w:t>
-      </w:r>
-      <w:proofErr w:type="spellEnd"/>
-      <w:r>
-        <w:t xml:space="preserve"> as </w:t>
-      </w:r>
-      <w:proofErr w:type="spellStart"/>
-      <w:r>
-        <w:t>plt</w:t>
-      </w:r>
-      <w:proofErr w:type="spellEnd"/>
+        <w:t>import matplotlib.pyplot as plt</w:t>
+      </w:r>
     </w:p>
     <w:p/>
     <w:p>
-      <w:proofErr w:type="spellStart"/>
-      <w:r>
-        <w:t>file_name</w:t>
-      </w:r>
-      <w:proofErr w:type="spellEnd"/>
-      <w:r>
-        <w:t xml:space="preserve"> = '000000397133.jpg'</w:t>
-      </w:r>
-    </w:p>
-    <w:p>
-      <w:proofErr w:type="spellStart"/>
-      <w:r>
-        <w:t>img</w:t>
-      </w:r>
-      <w:proofErr w:type="spellEnd"/>
-      <w:r>
-        <w:t xml:space="preserve"> = </w:t>
-      </w:r>
-      <w:proofErr w:type="spellStart"/>
-      <w:r>
-        <w:t>Image.open</w:t>
-      </w:r>
-      <w:proofErr w:type="spellEnd"/>
-      <w:r>
-        <w:t>(f'./dataset/val2017/{</w:t>
-      </w:r>
-      <w:proofErr w:type="spellStart"/>
-      <w:r>
-        <w:t>file_name</w:t>
-      </w:r>
-      <w:proofErr w:type="spellEnd"/>
-      <w:r>
-        <w:t>}')</w:t>
+      <w:r>
+        <w:t>file_name = '000000397133.jpg'</w:t>
+      </w:r>
+    </w:p>
+    <w:p>
+      <w:r>
+        <w:t>img = Image.open(f'./dataset/val2017/{file_name}')</w:t>
       </w:r>
     </w:p>
     <w:p/>
     <w:p>
-      <w:proofErr w:type="spellStart"/>
+      <w:r>
+        <w:t>plt.imshow(img)</w:t>
+      </w:r>
+    </w:p>
+    <w:p>
       <w:r>
         <w:lastRenderedPageBreak/>
-        <w:t>plt.imshow</w:t>
-      </w:r>
-      <w:proofErr w:type="spellEnd"/>
-      <w:r>
-        <w:t>(</w:t>
-      </w:r>
-      <w:proofErr w:type="spellStart"/>
-      <w:r>
-        <w:t>img</w:t>
-      </w:r>
-      <w:proofErr w:type="spellEnd"/>
-      <w:r>
-        <w:t>)</w:t>
-      </w:r>
-    </w:p>
-    <w:p>
-      <w:proofErr w:type="spellStart"/>
-      <w:r>
-        <w:t>plt.axis</w:t>
-      </w:r>
-      <w:proofErr w:type="spellEnd"/>
-      <w:r>
-        <w:t>('off')</w:t>
-      </w:r>
-    </w:p>
-    <w:p>
-      <w:proofErr w:type="spellStart"/>
-      <w:r>
-        <w:t>plt.show</w:t>
-      </w:r>
-      <w:proofErr w:type="spellEnd"/>
-      <w:r>
-        <w:t>()</w:t>
+        <w:t>plt.axis('off')</w:t>
+      </w:r>
+    </w:p>
+    <w:p>
+      <w:r>
+        <w:t>plt.show()</w:t>
+      </w:r>
+    </w:p>
+    <w:p/>
+    <w:p/>
+    <w:p/>
+    <w:p>
+      <w:r>
+        <w:t>python src/coco_loader.py</w:t>
       </w:r>
     </w:p>
     <w:sectPr>

</xml_diff>

<commit_message>
docs: add conference-ready explanation doc for dataset creation module
</commit_message>
<xml_diff>
--- a/myDocs/step.docx
+++ b/myDocs/step.docx
@@ -4,8 +4,13 @@
   <w:body>
     <w:p>
       <w:r>
-        <w:t>import json</w:t>
-      </w:r>
+        <w:t xml:space="preserve">import </w:t>
+      </w:r>
+      <w:proofErr w:type="spellStart"/>
+      <w:r>
+        <w:t>json</w:t>
+      </w:r>
+      <w:proofErr w:type="spellEnd"/>
     </w:p>
     <w:p>
       <w:r>
@@ -18,13 +23,31 @@
       </w:r>
     </w:p>
     <w:p>
-      <w:r>
-        <w:t>anns = json.load(file)</w:t>
-      </w:r>
-    </w:p>
-    <w:p>
-      <w:r>
-        <w:t>anns.keys()</w:t>
+      <w:proofErr w:type="spellStart"/>
+      <w:r>
+        <w:t>anns</w:t>
+      </w:r>
+      <w:proofErr w:type="spellEnd"/>
+      <w:r>
+        <w:t xml:space="preserve"> = </w:t>
+      </w:r>
+      <w:proofErr w:type="spellStart"/>
+      <w:r>
+        <w:t>json.load</w:t>
+      </w:r>
+      <w:proofErr w:type="spellEnd"/>
+      <w:r>
+        <w:t>(file)</w:t>
+      </w:r>
+    </w:p>
+    <w:p>
+      <w:proofErr w:type="spellStart"/>
+      <w:r>
+        <w:t>anns.keys</w:t>
+      </w:r>
+      <w:proofErr w:type="spellEnd"/>
+      <w:r>
+        <w:t>()</w:t>
       </w:r>
     </w:p>
     <w:p/>
@@ -50,8 +73,13 @@
     </w:p>
     <w:p>
       <w:r>
-        <w:t>import json</w:t>
-      </w:r>
+        <w:t xml:space="preserve">import </w:t>
+      </w:r>
+      <w:proofErr w:type="spellStart"/>
+      <w:r>
+        <w:t>json</w:t>
+      </w:r>
+      <w:proofErr w:type="spellEnd"/>
     </w:p>
     <w:p>
       <w:r>
@@ -65,28 +93,81 @@
     </w:p>
     <w:p>
       <w:r>
-        <w:t xml:space="preserve">    caps = json.load(file)</w:t>
+        <w:t xml:space="preserve">    caps = </w:t>
+      </w:r>
+      <w:proofErr w:type="spellStart"/>
+      <w:r>
+        <w:t>json.load</w:t>
+      </w:r>
+      <w:proofErr w:type="spellEnd"/>
+      <w:r>
+        <w:t>(file)</w:t>
       </w:r>
     </w:p>
     <w:p/>
     <w:p>
-      <w:r>
-        <w:t>image_id = 397133</w:t>
-      </w:r>
-    </w:p>
-    <w:p>
-      <w:r>
-        <w:t>for ann in caps['annotations']:</w:t>
-      </w:r>
-    </w:p>
-    <w:p>
-      <w:r>
-        <w:t xml:space="preserve">    if ann['image_id'] == image_id:</w:t>
-      </w:r>
-    </w:p>
-    <w:p>
-      <w:r>
-        <w:t xml:space="preserve">        print(ann['caption'])</w:t>
+      <w:proofErr w:type="spellStart"/>
+      <w:r>
+        <w:t>image_id</w:t>
+      </w:r>
+      <w:proofErr w:type="spellEnd"/>
+      <w:r>
+        <w:t xml:space="preserve"> = 397133</w:t>
+      </w:r>
+    </w:p>
+    <w:p>
+      <w:r>
+        <w:t xml:space="preserve">for </w:t>
+      </w:r>
+      <w:proofErr w:type="spellStart"/>
+      <w:r>
+        <w:t>ann</w:t>
+      </w:r>
+      <w:proofErr w:type="spellEnd"/>
+      <w:r>
+        <w:t xml:space="preserve"> in caps['annotations']:</w:t>
+      </w:r>
+    </w:p>
+    <w:p>
+      <w:r>
+        <w:t xml:space="preserve">    if </w:t>
+      </w:r>
+      <w:proofErr w:type="spellStart"/>
+      <w:r>
+        <w:t>ann</w:t>
+      </w:r>
+      <w:proofErr w:type="spellEnd"/>
+      <w:r>
+        <w:t>['</w:t>
+      </w:r>
+      <w:proofErr w:type="spellStart"/>
+      <w:r>
+        <w:t>image_id</w:t>
+      </w:r>
+      <w:proofErr w:type="spellEnd"/>
+      <w:r>
+        <w:t xml:space="preserve">'] == </w:t>
+      </w:r>
+      <w:proofErr w:type="spellStart"/>
+      <w:r>
+        <w:t>image_id</w:t>
+      </w:r>
+      <w:proofErr w:type="spellEnd"/>
+      <w:r>
+        <w:t>:</w:t>
+      </w:r>
+    </w:p>
+    <w:p>
+      <w:r>
+        <w:t xml:space="preserve">        print(</w:t>
+      </w:r>
+      <w:proofErr w:type="spellStart"/>
+      <w:r>
+        <w:t>ann</w:t>
+      </w:r>
+      <w:proofErr w:type="spellEnd"/>
+      <w:r>
+        <w:t>['caption'])</w:t>
       </w:r>
     </w:p>
     <w:p/>
@@ -130,35 +211,97 @@
     </w:p>
     <w:p>
       <w:r>
-        <w:t>import matplotlib.pyplot as plt</w:t>
-      </w:r>
+        <w:t xml:space="preserve">import </w:t>
+      </w:r>
+      <w:proofErr w:type="spellStart"/>
+      <w:r>
+        <w:t>matplotlib.pyplot</w:t>
+      </w:r>
+      <w:proofErr w:type="spellEnd"/>
+      <w:r>
+        <w:t xml:space="preserve"> as </w:t>
+      </w:r>
+      <w:proofErr w:type="spellStart"/>
+      <w:r>
+        <w:t>plt</w:t>
+      </w:r>
+      <w:proofErr w:type="spellEnd"/>
     </w:p>
     <w:p/>
     <w:p>
-      <w:r>
-        <w:t>file_name = '000000397133.jpg'</w:t>
-      </w:r>
-    </w:p>
-    <w:p>
-      <w:r>
-        <w:t>img = Image.open(f'./dataset/val2017/{file_name}')</w:t>
+      <w:proofErr w:type="spellStart"/>
+      <w:r>
+        <w:t>file_name</w:t>
+      </w:r>
+      <w:proofErr w:type="spellEnd"/>
+      <w:r>
+        <w:t xml:space="preserve"> = '000000397133.jpg'</w:t>
+      </w:r>
+    </w:p>
+    <w:p>
+      <w:proofErr w:type="spellStart"/>
+      <w:r>
+        <w:t>img</w:t>
+      </w:r>
+      <w:proofErr w:type="spellEnd"/>
+      <w:r>
+        <w:t xml:space="preserve"> = </w:t>
+      </w:r>
+      <w:proofErr w:type="spellStart"/>
+      <w:r>
+        <w:t>Image.open</w:t>
+      </w:r>
+      <w:proofErr w:type="spellEnd"/>
+      <w:r>
+        <w:t>(f'./dataset/val2017/{</w:t>
+      </w:r>
+      <w:proofErr w:type="spellStart"/>
+      <w:r>
+        <w:t>file_name</w:t>
+      </w:r>
+      <w:proofErr w:type="spellEnd"/>
+      <w:r>
+        <w:t>}')</w:t>
       </w:r>
     </w:p>
     <w:p/>
     <w:p>
-      <w:r>
-        <w:t>plt.imshow(img)</w:t>
-      </w:r>
-    </w:p>
-    <w:p>
+      <w:proofErr w:type="spellStart"/>
+      <w:r>
+        <w:t>plt.imshow</w:t>
+      </w:r>
+      <w:proofErr w:type="spellEnd"/>
+      <w:r>
+        <w:t>(</w:t>
+      </w:r>
+      <w:proofErr w:type="spellStart"/>
+      <w:r>
+        <w:t>img</w:t>
+      </w:r>
+      <w:proofErr w:type="spellEnd"/>
+      <w:r>
+        <w:t>)</w:t>
+      </w:r>
+    </w:p>
+    <w:p>
+      <w:proofErr w:type="spellStart"/>
       <w:r>
         <w:lastRenderedPageBreak/>
-        <w:t>plt.axis('off')</w:t>
-      </w:r>
-    </w:p>
-    <w:p>
-      <w:r>
-        <w:t>plt.show()</w:t>
+        <w:t>plt.axis</w:t>
+      </w:r>
+      <w:proofErr w:type="spellEnd"/>
+      <w:r>
+        <w:t>('off')</w:t>
+      </w:r>
+    </w:p>
+    <w:p>
+      <w:proofErr w:type="spellStart"/>
+      <w:r>
+        <w:t>plt.show</w:t>
+      </w:r>
+      <w:proofErr w:type="spellEnd"/>
+      <w:r>
+        <w:t>()</w:t>
       </w:r>
     </w:p>
     <w:p/>
@@ -167,6 +310,74 @@
     <w:p>
       <w:r>
         <w:t>python src/coco_loader.py</w:t>
+      </w:r>
+    </w:p>
+    <w:p/>
+    <w:p/>
+    <w:p/>
+    <w:p>
+      <w:r>
+        <w:t xml:space="preserve">STEP </w:t>
+      </w:r>
+      <w:r>
+        <w:t>3</w:t>
+      </w:r>
+      <w:r>
+        <w:t xml:space="preserve"> :  </w:t>
+      </w:r>
+      <w:r>
+        <w:tab/>
+      </w:r>
+      <w:r>
+        <w:t xml:space="preserve">python src/embedding.py        </w:t>
+      </w:r>
+    </w:p>
+    <w:p>
+      <w:r>
+        <w:t xml:space="preserve">STEP 4 :  </w:t>
+      </w:r>
+      <w:r>
+        <w:tab/>
+      </w:r>
+      <w:r>
+        <w:t xml:space="preserve"> </w:t>
+      </w:r>
+      <w:r>
+        <w:t>python src/caption_diversity.py</w:t>
+      </w:r>
+      <w:r>
+        <w:t xml:space="preserve"> </w:t>
+      </w:r>
+    </w:p>
+    <w:p>
+      <w:r>
+        <w:t xml:space="preserve">STEP </w:t>
+      </w:r>
+      <w:r>
+        <w:t xml:space="preserve">5 </w:t>
+      </w:r>
+      <w:r>
+        <w:t xml:space="preserve">:  </w:t>
+      </w:r>
+      <w:r>
+        <w:tab/>
+      </w:r>
+      <w:r>
+        <w:t>python src/feature_extractor.py</w:t>
+      </w:r>
+    </w:p>
+    <w:p>
+      <w:r>
+        <w:t>STEP</w:t>
+      </w:r>
+      <w:r>
+        <w:t xml:space="preserve"> 6 </w:t>
+      </w:r>
+      <w:r>
+        <w:t xml:space="preserve">:  </w:t>
+      </w:r>
+      <w:r>
+        <w:tab/>
       </w:r>
     </w:p>
     <w:sectPr>

</xml_diff>

<commit_message>
Add Random Forest + XGBoost training pipeline with docs
Adds ModelTrainer to train and tune Random Forest and XGBoost
classifiers on human_dataset.csv, predicting ambiguity_label via an
80/20 split, baseline cross-validation, GridSearchCV hyperparameter
tuning, and Accuracy/Precision/Recall/F1/ROC-AUC evaluation. The best
model (by accuracy) is persisted with joblib via src/train.py.

Also adds a conference-ready explanation doc covering the pipeline,
why Random Forest and XGBoost were chosen, and the label-provenance
caveat behind the near-perfect scores.

Co-authored-by: Cursor <cursoragent@cursor.com>
</commit_message>
<xml_diff>
--- a/myDocs/step.docx
+++ b/myDocs/step.docx
@@ -4,13 +4,8 @@
   <w:body>
     <w:p>
       <w:r>
-        <w:t xml:space="preserve">import </w:t>
-      </w:r>
-      <w:proofErr w:type="spellStart"/>
-      <w:r>
-        <w:t>json</w:t>
-      </w:r>
-      <w:proofErr w:type="spellEnd"/>
+        <w:t>import json</w:t>
+      </w:r>
     </w:p>
     <w:p>
       <w:r>
@@ -23,31 +18,13 @@
       </w:r>
     </w:p>
     <w:p>
-      <w:proofErr w:type="spellStart"/>
-      <w:r>
-        <w:t>anns</w:t>
-      </w:r>
-      <w:proofErr w:type="spellEnd"/>
-      <w:r>
-        <w:t xml:space="preserve"> = </w:t>
-      </w:r>
-      <w:proofErr w:type="spellStart"/>
-      <w:r>
-        <w:t>json.load</w:t>
-      </w:r>
-      <w:proofErr w:type="spellEnd"/>
-      <w:r>
-        <w:t>(file)</w:t>
-      </w:r>
-    </w:p>
-    <w:p>
-      <w:proofErr w:type="spellStart"/>
-      <w:r>
-        <w:t>anns.keys</w:t>
-      </w:r>
-      <w:proofErr w:type="spellEnd"/>
-      <w:r>
-        <w:t>()</w:t>
+      <w:r>
+        <w:t>anns = json.load(file)</w:t>
+      </w:r>
+    </w:p>
+    <w:p>
+      <w:r>
+        <w:t>anns.keys()</w:t>
       </w:r>
     </w:p>
     <w:p/>
@@ -73,13 +50,8 @@
     </w:p>
     <w:p>
       <w:r>
-        <w:t xml:space="preserve">import </w:t>
-      </w:r>
-      <w:proofErr w:type="spellStart"/>
-      <w:r>
-        <w:t>json</w:t>
-      </w:r>
-      <w:proofErr w:type="spellEnd"/>
+        <w:t>import json</w:t>
+      </w:r>
     </w:p>
     <w:p>
       <w:r>
@@ -93,81 +65,28 @@
     </w:p>
     <w:p>
       <w:r>
-        <w:t xml:space="preserve">    caps = </w:t>
-      </w:r>
-      <w:proofErr w:type="spellStart"/>
-      <w:r>
-        <w:t>json.load</w:t>
-      </w:r>
-      <w:proofErr w:type="spellEnd"/>
-      <w:r>
-        <w:t>(file)</w:t>
+        <w:t xml:space="preserve">    caps = json.load(file)</w:t>
       </w:r>
     </w:p>
     <w:p/>
     <w:p>
-      <w:proofErr w:type="spellStart"/>
-      <w:r>
-        <w:t>image_id</w:t>
-      </w:r>
-      <w:proofErr w:type="spellEnd"/>
-      <w:r>
-        <w:t xml:space="preserve"> = 397133</w:t>
-      </w:r>
-    </w:p>
-    <w:p>
-      <w:r>
-        <w:t xml:space="preserve">for </w:t>
-      </w:r>
-      <w:proofErr w:type="spellStart"/>
-      <w:r>
-        <w:t>ann</w:t>
-      </w:r>
-      <w:proofErr w:type="spellEnd"/>
-      <w:r>
-        <w:t xml:space="preserve"> in caps['annotations']:</w:t>
-      </w:r>
-    </w:p>
-    <w:p>
-      <w:r>
-        <w:t xml:space="preserve">    if </w:t>
-      </w:r>
-      <w:proofErr w:type="spellStart"/>
-      <w:r>
-        <w:t>ann</w:t>
-      </w:r>
-      <w:proofErr w:type="spellEnd"/>
-      <w:r>
-        <w:t>['</w:t>
-      </w:r>
-      <w:proofErr w:type="spellStart"/>
-      <w:r>
-        <w:t>image_id</w:t>
-      </w:r>
-      <w:proofErr w:type="spellEnd"/>
-      <w:r>
-        <w:t xml:space="preserve">'] == </w:t>
-      </w:r>
-      <w:proofErr w:type="spellStart"/>
-      <w:r>
-        <w:t>image_id</w:t>
-      </w:r>
-      <w:proofErr w:type="spellEnd"/>
-      <w:r>
-        <w:t>:</w:t>
-      </w:r>
-    </w:p>
-    <w:p>
-      <w:r>
-        <w:t xml:space="preserve">        print(</w:t>
-      </w:r>
-      <w:proofErr w:type="spellStart"/>
-      <w:r>
-        <w:t>ann</w:t>
-      </w:r>
-      <w:proofErr w:type="spellEnd"/>
-      <w:r>
-        <w:t>['caption'])</w:t>
+      <w:r>
+        <w:t>image_id = 397133</w:t>
+      </w:r>
+    </w:p>
+    <w:p>
+      <w:r>
+        <w:t>for ann in caps['annotations']:</w:t>
+      </w:r>
+    </w:p>
+    <w:p>
+      <w:r>
+        <w:t xml:space="preserve">    if ann['image_id'] == image_id:</w:t>
+      </w:r>
+    </w:p>
+    <w:p>
+      <w:r>
+        <w:t xml:space="preserve">        print(ann['caption'])</w:t>
       </w:r>
     </w:p>
     <w:p/>
@@ -211,97 +130,35 @@
     </w:p>
     <w:p>
       <w:r>
-        <w:t xml:space="preserve">import </w:t>
-      </w:r>
-      <w:proofErr w:type="spellStart"/>
-      <w:r>
-        <w:t>matplotlib.pyplot</w:t>
-      </w:r>
-      <w:proofErr w:type="spellEnd"/>
-      <w:r>
-        <w:t xml:space="preserve"> as </w:t>
-      </w:r>
-      <w:proofErr w:type="spellStart"/>
-      <w:r>
-        <w:t>plt</w:t>
-      </w:r>
-      <w:proofErr w:type="spellEnd"/>
+        <w:t>import matplotlib.pyplot as plt</w:t>
+      </w:r>
     </w:p>
     <w:p/>
     <w:p>
-      <w:proofErr w:type="spellStart"/>
-      <w:r>
-        <w:t>file_name</w:t>
-      </w:r>
-      <w:proofErr w:type="spellEnd"/>
-      <w:r>
-        <w:t xml:space="preserve"> = '000000397133.jpg'</w:t>
-      </w:r>
-    </w:p>
-    <w:p>
-      <w:proofErr w:type="spellStart"/>
-      <w:r>
-        <w:t>img</w:t>
-      </w:r>
-      <w:proofErr w:type="spellEnd"/>
-      <w:r>
-        <w:t xml:space="preserve"> = </w:t>
-      </w:r>
-      <w:proofErr w:type="spellStart"/>
-      <w:r>
-        <w:t>Image.open</w:t>
-      </w:r>
-      <w:proofErr w:type="spellEnd"/>
-      <w:r>
-        <w:t>(f'./dataset/val2017/{</w:t>
-      </w:r>
-      <w:proofErr w:type="spellStart"/>
-      <w:r>
-        <w:t>file_name</w:t>
-      </w:r>
-      <w:proofErr w:type="spellEnd"/>
-      <w:r>
-        <w:t>}')</w:t>
+      <w:r>
+        <w:t>file_name = '000000397133.jpg'</w:t>
+      </w:r>
+    </w:p>
+    <w:p>
+      <w:r>
+        <w:t>img = Image.open(f'./dataset/val2017/{file_name}')</w:t>
       </w:r>
     </w:p>
     <w:p/>
     <w:p>
-      <w:proofErr w:type="spellStart"/>
-      <w:r>
-        <w:t>plt.imshow</w:t>
-      </w:r>
-      <w:proofErr w:type="spellEnd"/>
-      <w:r>
-        <w:t>(</w:t>
-      </w:r>
-      <w:proofErr w:type="spellStart"/>
-      <w:r>
-        <w:t>img</w:t>
-      </w:r>
-      <w:proofErr w:type="spellEnd"/>
-      <w:r>
-        <w:t>)</w:t>
-      </w:r>
-    </w:p>
-    <w:p>
-      <w:proofErr w:type="spellStart"/>
+      <w:r>
+        <w:t>plt.imshow(img)</w:t>
+      </w:r>
+    </w:p>
+    <w:p>
       <w:r>
         <w:lastRenderedPageBreak/>
-        <w:t>plt.axis</w:t>
-      </w:r>
-      <w:proofErr w:type="spellEnd"/>
-      <w:r>
-        <w:t>('off')</w:t>
-      </w:r>
-    </w:p>
-    <w:p>
-      <w:proofErr w:type="spellStart"/>
-      <w:r>
-        <w:t>plt.show</w:t>
-      </w:r>
-      <w:proofErr w:type="spellEnd"/>
-      <w:r>
-        <w:t>()</w:t>
+        <w:t>plt.axis('off')</w:t>
+      </w:r>
+    </w:p>
+    <w:p>
+      <w:r>
+        <w:t>plt.show()</w:t>
       </w:r>
     </w:p>
     <w:p/>
@@ -367,6 +224,12 @@
       </w:r>
     </w:p>
     <w:p>
+      <w:pPr>
+        <w:spacing w:after="0" w:line="240" w:lineRule="auto"/>
+        <w:rPr>
+          <w:rFonts w:ascii="Times New Roman" w:hAnsi="Times New Roman" w:cs="Times New Roman"/>
+        </w:rPr>
+      </w:pPr>
       <w:r>
         <w:t>STEP</w:t>
       </w:r>
@@ -379,7 +242,115 @@
       <w:r>
         <w:tab/>
       </w:r>
-    </w:p>
+      <w:r>
+        <w:rPr>
+          <w:rFonts w:ascii="Times New Roman" w:hAnsi="Times New Roman" w:cs="Times New Roman"/>
+        </w:rPr>
+        <w:t>python src/create_dataset.py</w:t>
+      </w:r>
+    </w:p>
+    <w:p>
+      <w:pPr>
+        <w:spacing w:after="0" w:line="240" w:lineRule="auto"/>
+        <w:rPr>
+          <w:rFonts w:ascii="Times New Roman" w:hAnsi="Times New Roman" w:cs="Times New Roman"/>
+        </w:rPr>
+      </w:pPr>
+    </w:p>
+    <w:p>
+      <w:pPr>
+        <w:spacing w:after="0" w:line="240" w:lineRule="auto"/>
+      </w:pPr>
+      <w:r>
+        <w:t xml:space="preserve">STEP </w:t>
+      </w:r>
+      <w:r>
+        <w:t>7</w:t>
+      </w:r>
+      <w:r>
+        <w:t xml:space="preserve"> :</w:t>
+      </w:r>
+      <w:r>
+        <w:tab/>
+      </w:r>
+      <w:r>
+        <w:t>python src/generate_labels.py</w:t>
+      </w:r>
+    </w:p>
+    <w:p>
+      <w:pPr>
+        <w:spacing w:after="0" w:line="240" w:lineRule="auto"/>
+      </w:pPr>
+    </w:p>
+    <w:p>
+      <w:pPr>
+        <w:spacing w:after="0" w:line="240" w:lineRule="auto"/>
+      </w:pPr>
+      <w:r>
+        <w:t>STEP 8 :</w:t>
+      </w:r>
+      <w:r>
+        <w:tab/>
+      </w:r>
+      <w:r>
+        <w:rPr>
+          <w:rFonts w:ascii="Times New Roman" w:hAnsi="Times New Roman" w:cs="Times New Roman"/>
+        </w:rPr>
+        <w:t>python src/train.py</w:t>
+      </w:r>
+      <w:r>
+        <w:t xml:space="preserve">  </w:t>
+      </w:r>
+    </w:p>
+    <w:p>
+      <w:pPr>
+        <w:spacing w:after="0" w:line="240" w:lineRule="auto"/>
+        <w:rPr>
+          <w:rFonts w:ascii="Times New Roman" w:hAnsi="Times New Roman" w:cs="Times New Roman"/>
+        </w:rPr>
+      </w:pPr>
+      <w:r>
+        <w:rPr>
+          <w:rFonts w:ascii="Times New Roman" w:hAnsi="Times New Roman" w:cs="Times New Roman"/>
+        </w:rPr>
+        <w:drawing>
+          <wp:inline distT="0" distB="0" distL="0" distR="0" wp14:anchorId="1561D513" wp14:editId="39639F2D">
+            <wp:extent cx="5731510" cy="2800350"/>
+            <wp:effectExtent l="0" t="0" r="2540" b="0"/>
+            <wp:docPr id="1746332683" name="Picture 1"/>
+            <wp:cNvGraphicFramePr>
+              <a:graphicFrameLocks xmlns:a="http://schemas.openxmlformats.org/drawingml/2006/main" noChangeAspect="1"/>
+            </wp:cNvGraphicFramePr>
+            <a:graphic xmlns:a="http://schemas.openxmlformats.org/drawingml/2006/main">
+              <a:graphicData uri="http://schemas.openxmlformats.org/drawingml/2006/picture">
+                <pic:pic xmlns:pic="http://schemas.openxmlformats.org/drawingml/2006/picture">
+                  <pic:nvPicPr>
+                    <pic:cNvPr id="1746332683" name=""/>
+                    <pic:cNvPicPr/>
+                  </pic:nvPicPr>
+                  <pic:blipFill>
+                    <a:blip r:embed="rId4"/>
+                    <a:stretch>
+                      <a:fillRect/>
+                    </a:stretch>
+                  </pic:blipFill>
+                  <pic:spPr>
+                    <a:xfrm>
+                      <a:off x="0" y="0"/>
+                      <a:ext cx="5731510" cy="2800350"/>
+                    </a:xfrm>
+                    <a:prstGeom prst="rect">
+                      <a:avLst/>
+                    </a:prstGeom>
+                  </pic:spPr>
+                </pic:pic>
+              </a:graphicData>
+            </a:graphic>
+          </wp:inline>
+        </w:drawing>
+      </w:r>
+    </w:p>
+    <w:p/>
     <w:sectPr>
       <w:pgSz w:w="11906" w:h="16838"/>
       <w:pgMar w:top="1440" w:right="1440" w:bottom="1440" w:left="1440" w:header="708" w:footer="708" w:gutter="0"/>

</xml_diff>

<commit_message>
Add SHAP explainability for Random Forest predictions
</commit_message>
<xml_diff>
--- a/myDocs/step.docx
+++ b/myDocs/step.docx
@@ -329,7 +329,7 @@
                     <pic:cNvPicPr/>
                   </pic:nvPicPr>
                   <pic:blipFill>
-                    <a:blip r:embed="rId4"/>
+                    <a:blip r:embed="rId5"/>
                     <a:stretch>
                       <a:fillRect/>
                     </a:stretch>
@@ -351,6 +351,302 @@
       </w:r>
     </w:p>
     <w:p/>
+    <w:p/>
+    <w:p/>
+    <w:p/>
+    <w:p>
+      <w:pPr>
+        <w:rPr>
+          <w:rFonts w:ascii="Times New Roman" w:hAnsi="Times New Roman" w:cs="Times New Roman"/>
+          <w:b/>
+          <w:bCs/>
+        </w:rPr>
+      </w:pPr>
+      <w:r>
+        <w:lastRenderedPageBreak/>
+        <w:t>STEP 9:</w:t>
+      </w:r>
+      <w:r>
+        <w:t xml:space="preserve"> </w:t>
+      </w:r>
+      <w:r>
+        <w:rPr>
+          <w:rFonts w:ascii="Times New Roman" w:hAnsi="Times New Roman" w:cs="Times New Roman"/>
+          <w:b/>
+          <w:bCs/>
+        </w:rPr>
+        <w:t>SHAP</w:t>
+      </w:r>
+    </w:p>
+    <w:p>
+      <w:r>
+        <w:t>python src/shap_analysis.py</w:t>
+      </w:r>
+    </w:p>
+    <w:p>
+      <w:r>
+        <w:t>I built the </w:t>
+      </w:r>
+      <w:r>
+        <w:rPr>
+          <w:b/>
+          <w:bCs/>
+        </w:rPr>
+        <w:t>SHAP explainability module</w:t>
+      </w:r>
+      <w:r>
+        <w:t> as requested, but hit a significant environment obstacle along the way worth flagging.</w:t>
+      </w:r>
+    </w:p>
+    <w:p>
+      <w:pPr>
+        <w:rPr>
+          <w:b/>
+          <w:bCs/>
+        </w:rPr>
+      </w:pPr>
+      <w:r>
+        <w:rPr>
+          <w:b/>
+          <w:bCs/>
+        </w:rPr>
+        <w:t>The blocker: numba blocked by Windows Application Control policy</w:t>
+      </w:r>
+    </w:p>
+    <w:p>
+      <w:r>
+        <w:t>shap unconditionally imports numba at package init (for a few clustering helpers used only by some plotting utilities), but on this machine, import numba fails outright:</w:t>
+      </w:r>
+    </w:p>
+    <w:p>
+      <w:r>
+        <w:t>ImportError: DLL load failed while importing _devicearray: An Application Control policy has blocked this file.</w:t>
+      </w:r>
+    </w:p>
+    <w:p>
+      <w:r>
+        <w:t>This is an OS-level security policy blocking numba's native extensions — reinstalling numba didn't help, confirming it's not a corrupted install. Since numba isn't actually needed for TreeExplainer (only for njit-decorated hierarchical-clustering helpers and numba.typed.List elsewhere in shap), I wrote a </w:t>
+      </w:r>
+      <w:r>
+        <w:rPr>
+          <w:b/>
+          <w:bCs/>
+        </w:rPr>
+        <w:t>pure-Python compatibility shim</w:t>
+      </w:r>
+      <w:r>
+        <w:t> (image_ambiguity/explainability/numba_stub.py) that installs a no-op stand-in for numba only when the real one can't load — making @njit an identity decorator and numba.typed.List an alias for list. This lets import shap succeed with zero loss of correctness (just no JIT speedup, irrelevant for our small dataset).</w:t>
+      </w:r>
+    </w:p>
+    <w:p>
+      <w:pPr>
+        <w:rPr>
+          <w:b/>
+          <w:bCs/>
+        </w:rPr>
+      </w:pPr>
+      <w:r>
+        <w:rPr>
+          <w:b/>
+          <w:bCs/>
+        </w:rPr>
+        <w:t>What was built</w:t>
+      </w:r>
+    </w:p>
+    <w:p>
+      <w:r>
+        <w:rPr>
+          <w:b/>
+          <w:bCs/>
+        </w:rPr>
+        <w:t>SHAPExplainer</w:t>
+      </w:r>
+      <w:r>
+        <w:t> (image_ambiguity/explainability/shap_explainer.py):</w:t>
+      </w:r>
+    </w:p>
+    <w:p>
+      <w:pPr>
+        <w:numPr>
+          <w:ilvl w:val="0"/>
+          <w:numId w:val="1"/>
+        </w:numPr>
+      </w:pPr>
+      <w:r>
+        <w:t>compute_shap_values() — wraps shap.TreeExplainer</w:t>
+      </w:r>
+    </w:p>
+    <w:p>
+      <w:pPr>
+        <w:numPr>
+          <w:ilvl w:val="0"/>
+          <w:numId w:val="1"/>
+        </w:numPr>
+      </w:pPr>
+      <w:r>
+        <w:t>top_feature_importance() + plot_top_feature_importance() — mean |SHAP value| ranking, bar chart</w:t>
+      </w:r>
+    </w:p>
+    <w:p>
+      <w:pPr>
+        <w:numPr>
+          <w:ilvl w:val="0"/>
+          <w:numId w:val="1"/>
+        </w:numPr>
+      </w:pPr>
+      <w:r>
+        <w:t>summary_plot() — beeswarm plot for a chosen class</w:t>
+      </w:r>
+    </w:p>
+    <w:p>
+      <w:pPr>
+        <w:numPr>
+          <w:ilvl w:val="0"/>
+          <w:numId w:val="1"/>
+        </w:numPr>
+      </w:pPr>
+      <w:r>
+        <w:t>waterfall_plot() — single-prediction waterfall</w:t>
+      </w:r>
+    </w:p>
+    <w:p>
+      <w:pPr>
+        <w:numPr>
+          <w:ilvl w:val="0"/>
+          <w:numId w:val="1"/>
+        </w:numPr>
+      </w:pPr>
+      <w:r>
+        <w:t>force_plot() — static matplotlib force plot (rounded value labels for legibility)</w:t>
+      </w:r>
+    </w:p>
+    <w:p>
+      <w:pPr>
+        <w:numPr>
+          <w:ilvl w:val="0"/>
+          <w:numId w:val="1"/>
+        </w:numPr>
+      </w:pPr>
+      <w:r>
+        <w:t>explain_prediction() → PredictionExplanation — structured, human-readable top-feature breakdown</w:t>
+      </w:r>
+    </w:p>
+    <w:p>
+      <w:r>
+        <w:rPr>
+          <w:b/>
+          <w:bCs/>
+        </w:rPr>
+        <w:t>Runnable script</w:t>
+      </w:r>
+      <w:r>
+        <w:t>: src/shap_analysis.py — loads models/random_forest.joblib + human_dataset.csv, generates all four plots, and explains one prediction.</w:t>
+      </w:r>
+    </w:p>
+    <w:p>
+      <w:r>
+        <w:rPr>
+          <w:b/>
+          <w:bCs/>
+        </w:rPr>
+        <w:t>Test run</w:t>
+      </w:r>
+      <w:r>
+        <w:t> (python src/shap_analysis.py) — top features are </w:t>
+      </w:r>
+      <w:r>
+        <w:rPr>
+          <w:b/>
+          <w:bCs/>
+        </w:rPr>
+        <w:t>average_similarity</w:t>
+      </w:r>
+      <w:r>
+        <w:t> and </w:t>
+      </w:r>
+      <w:r>
+        <w:rPr>
+          <w:b/>
+          <w:bCs/>
+        </w:rPr>
+        <w:t>caption_diversity</w:t>
+      </w:r>
+      <w:r>
+        <w:t xml:space="preserve">, dwarfing all OpenCV features, which is the expected/consistent story from earlier modules (the label is literally derived </w:t>
+      </w:r>
+      <w:r>
+        <w:lastRenderedPageBreak/>
+        <w:t>from caption_diversity). It explained image 425227, predicted </w:t>
+      </w:r>
+      <w:r>
+        <w:rPr>
+          <w:b/>
+          <w:bCs/>
+        </w:rPr>
+        <w:t>High</w:t>
+      </w:r>
+      <w:r>
+        <w:t> ambiguity at 72% probability, driven mainly by high caption_diversity (0.72) and low average_similarity (0.28).</w:t>
+      </w:r>
+    </w:p>
+    <w:p>
+      <w:r>
+        <w:rPr>
+          <w:b/>
+          <w:bCs/>
+        </w:rPr>
+        <w:t>Tests</w:t>
+      </w:r>
+      <w:r>
+        <w:t>: test_numba_stub.py (6 tests) + test_shap_explainer.py (16 tests). Full suite: </w:t>
+      </w:r>
+      <w:r>
+        <w:rPr>
+          <w:b/>
+          <w:bCs/>
+        </w:rPr>
+        <w:t>132 passed</w:t>
+      </w:r>
+      <w:r>
+        <w:t>, no linter errors.</w:t>
+      </w:r>
+    </w:p>
+    <w:p>
+      <w:pPr>
+        <w:rPr>
+          <w:b/>
+          <w:bCs/>
+        </w:rPr>
+      </w:pPr>
+      <w:r>
+        <w:rPr>
+          <w:b/>
+          <w:bCs/>
+        </w:rPr>
+        <w:t>Design note</w:t>
+      </w:r>
+    </w:p>
+    <w:p>
+      <w:r>
+        <w:t>explainability is </w:t>
+      </w:r>
+      <w:r>
+        <w:rPr>
+          <w:b/>
+          <w:bCs/>
+        </w:rPr>
+        <w:t>not</w:t>
+      </w:r>
+      <w:r>
+        <w:t> re-exported from the top-level image_ambiguity/__init__.py — importing it triggers the numba probe + shap import, which adds real startup cost that unrelated scripts (COCO loading, training, etc.) shouldn't pay every time. It's opt-in via from image_ambiguity.explainability import SHAPExplainer.</w:t>
+      </w:r>
+    </w:p>
+    <w:p>
+      <w:r>
+        <w:t>Nothing has been committed yet — let me know if you'd like a commit message for this.</w:t>
+      </w:r>
+    </w:p>
+    <w:p/>
     <w:sectPr>
       <w:pgSz w:w="11906" w:h="16838"/>
       <w:pgMar w:top="1440" w:right="1440" w:bottom="1440" w:left="1440" w:header="708" w:footer="708" w:gutter="0"/>
@@ -359,6 +655,163 @@
     </w:sectPr>
   </w:body>
 </w:document>
+</file>
+
+<file path=word/numbering.xml><?xml version="1.0" encoding="utf-8"?>
+<w:numbering xmlns:wpc="http://schemas.microsoft.com/office/word/2010/wordprocessingCanvas" xmlns:cx="http://schemas.microsoft.com/office/drawing/2014/chartex" xmlns:cx1="http://schemas.microsoft.com/office/drawing/2015/9/8/chartex" xmlns:cx2="http://schemas.microsoft.com/office/drawing/2015/10/21/chartex" xmlns:cx3="http://schemas.microsoft.com/office/drawing/2016/5/9/chartex" xmlns:cx4="http://schemas.microsoft.com/office/drawing/2016/5/10/chartex" xmlns:cx5="http://schemas.microsoft.com/office/drawing/2016/5/11/chartex" xmlns:cx6="http://schemas.microsoft.com/office/drawing/2016/5/12/chartex" xmlns:cx7="http://schemas.microsoft.com/office/drawing/2016/5/13/chartex" xmlns:cx8="http://schemas.microsoft.com/office/drawing/2016/5/14/chartex" xmlns:mc="http://schemas.openxmlformats.org/markup-compatibility/2006" xmlns:aink="http://schemas.microsoft.com/office/drawing/2016/ink" xmlns:am3d="http://schemas.microsoft.com/office/drawing/2017/model3d" xmlns:o="urn:schemas-microsoft-com:office:office" xmlns:oel="http://schemas.microsoft.com/office/2019/extlst" xmlns:r="http://schemas.openxmlformats.org/officeDocument/2006/relationships" xmlns:m="http://schemas.openxmlformats.org/officeDocument/2006/math" xmlns:v="urn:schemas-microsoft-com:vml" xmlns:wp14="http://schemas.microsoft.com/office/word/2010/wordprocessingDrawing" xmlns:wp="http://schemas.openxmlformats.org/drawingml/2006/wordprocessingDrawing" xmlns:w10="urn:schemas-microsoft-com:office:word" xmlns:w="http://schemas.openxmlformats.org/wordprocessingml/2006/main" xmlns:w14="http://schemas.microsoft.com/office/word/2010/wordml" xmlns:w15="http://schemas.microsoft.com/office/word/2012/wordml" xmlns:w16cex="http://schemas.microsoft.com/office/word/2018/wordml/cex" xmlns:w16cid="http://schemas.microsoft.com/office/word/2016/wordml/cid" xmlns:w16="http://schemas.microsoft.com/office/word/2018/wordml" xmlns:w16du="http://schemas.microsoft.com/office/word/2023/wordml/word16du" xmlns:w16sdtdh="http://schemas.microsoft.com/office/word/2020/wordml/sdtdatahash" xmlns:w16sdtfl="http://schemas.microsoft.com/office/word/2024/wordml/sdtformatlock" xmlns:w16se="http://schemas.microsoft.com/office/word/2015/wordml/symex" xmlns:wpg="http://schemas.microsoft.com/office/word/2010/wordprocessingGroup" xmlns:wpi="http://schemas.microsoft.com/office/word/2010/wordprocessingInk" xmlns:wne="http://schemas.microsoft.com/office/word/2006/wordml" xmlns:wps="http://schemas.microsoft.com/office/word/2010/wordprocessingShape" mc:Ignorable="w14 w15 w16se w16cid w16 w16cex w16sdtdh w16sdtfl w16du wp14">
+  <w:abstractNum w:abstractNumId="0" w15:restartNumberingAfterBreak="0">
+    <w:nsid w:val="53A7730B"/>
+    <w:multiLevelType w:val="multilevel"/>
+    <w:tmpl w:val="6CDA7C92"/>
+    <w:lvl w:ilvl="0">
+      <w:start w:val="1"/>
+      <w:numFmt w:val="bullet"/>
+      <w:lvlText w:val=""/>
+      <w:lvlJc w:val="left"/>
+      <w:pPr>
+        <w:tabs>
+          <w:tab w:val="num" w:pos="720"/>
+        </w:tabs>
+        <w:ind w:left="720" w:hanging="360"/>
+      </w:pPr>
+      <w:rPr>
+        <w:rFonts w:ascii="Symbol" w:hAnsi="Symbol" w:hint="default"/>
+        <w:sz w:val="20"/>
+      </w:rPr>
+    </w:lvl>
+    <w:lvl w:ilvl="1" w:tentative="1">
+      <w:start w:val="1"/>
+      <w:numFmt w:val="bullet"/>
+      <w:lvlText w:val="o"/>
+      <w:lvlJc w:val="left"/>
+      <w:pPr>
+        <w:tabs>
+          <w:tab w:val="num" w:pos="1440"/>
+        </w:tabs>
+        <w:ind w:left="1440" w:hanging="360"/>
+      </w:pPr>
+      <w:rPr>
+        <w:rFonts w:ascii="Courier New" w:hAnsi="Courier New" w:hint="default"/>
+        <w:sz w:val="20"/>
+      </w:rPr>
+    </w:lvl>
+    <w:lvl w:ilvl="2" w:tentative="1">
+      <w:start w:val="1"/>
+      <w:numFmt w:val="bullet"/>
+      <w:lvlText w:val=""/>
+      <w:lvlJc w:val="left"/>
+      <w:pPr>
+        <w:tabs>
+          <w:tab w:val="num" w:pos="2160"/>
+        </w:tabs>
+        <w:ind w:left="2160" w:hanging="360"/>
+      </w:pPr>
+      <w:rPr>
+        <w:rFonts w:ascii="Wingdings" w:hAnsi="Wingdings" w:hint="default"/>
+        <w:sz w:val="20"/>
+      </w:rPr>
+    </w:lvl>
+    <w:lvl w:ilvl="3" w:tentative="1">
+      <w:start w:val="1"/>
+      <w:numFmt w:val="bullet"/>
+      <w:lvlText w:val=""/>
+      <w:lvlJc w:val="left"/>
+      <w:pPr>
+        <w:tabs>
+          <w:tab w:val="num" w:pos="2880"/>
+        </w:tabs>
+        <w:ind w:left="2880" w:hanging="360"/>
+      </w:pPr>
+      <w:rPr>
+        <w:rFonts w:ascii="Wingdings" w:hAnsi="Wingdings" w:hint="default"/>
+        <w:sz w:val="20"/>
+      </w:rPr>
+    </w:lvl>
+    <w:lvl w:ilvl="4" w:tentative="1">
+      <w:start w:val="1"/>
+      <w:numFmt w:val="bullet"/>
+      <w:lvlText w:val=""/>
+      <w:lvlJc w:val="left"/>
+      <w:pPr>
+        <w:tabs>
+          <w:tab w:val="num" w:pos="3600"/>
+        </w:tabs>
+        <w:ind w:left="3600" w:hanging="360"/>
+      </w:pPr>
+      <w:rPr>
+        <w:rFonts w:ascii="Wingdings" w:hAnsi="Wingdings" w:hint="default"/>
+        <w:sz w:val="20"/>
+      </w:rPr>
+    </w:lvl>
+    <w:lvl w:ilvl="5" w:tentative="1">
+      <w:start w:val="1"/>
+      <w:numFmt w:val="bullet"/>
+      <w:lvlText w:val=""/>
+      <w:lvlJc w:val="left"/>
+      <w:pPr>
+        <w:tabs>
+          <w:tab w:val="num" w:pos="4320"/>
+        </w:tabs>
+        <w:ind w:left="4320" w:hanging="360"/>
+      </w:pPr>
+      <w:rPr>
+        <w:rFonts w:ascii="Wingdings" w:hAnsi="Wingdings" w:hint="default"/>
+        <w:sz w:val="20"/>
+      </w:rPr>
+    </w:lvl>
+    <w:lvl w:ilvl="6" w:tentative="1">
+      <w:start w:val="1"/>
+      <w:numFmt w:val="bullet"/>
+      <w:lvlText w:val=""/>
+      <w:lvlJc w:val="left"/>
+      <w:pPr>
+        <w:tabs>
+          <w:tab w:val="num" w:pos="5040"/>
+        </w:tabs>
+        <w:ind w:left="5040" w:hanging="360"/>
+      </w:pPr>
+      <w:rPr>
+        <w:rFonts w:ascii="Wingdings" w:hAnsi="Wingdings" w:hint="default"/>
+        <w:sz w:val="20"/>
+      </w:rPr>
+    </w:lvl>
+    <w:lvl w:ilvl="7" w:tentative="1">
+      <w:start w:val="1"/>
+      <w:numFmt w:val="bullet"/>
+      <w:lvlText w:val=""/>
+      <w:lvlJc w:val="left"/>
+      <w:pPr>
+        <w:tabs>
+          <w:tab w:val="num" w:pos="5760"/>
+        </w:tabs>
+        <w:ind w:left="5760" w:hanging="360"/>
+      </w:pPr>
+      <w:rPr>
+        <w:rFonts w:ascii="Wingdings" w:hAnsi="Wingdings" w:hint="default"/>
+        <w:sz w:val="20"/>
+      </w:rPr>
+    </w:lvl>
+    <w:lvl w:ilvl="8" w:tentative="1">
+      <w:start w:val="1"/>
+      <w:numFmt w:val="bullet"/>
+      <w:lvlText w:val=""/>
+      <w:lvlJc w:val="left"/>
+      <w:pPr>
+        <w:tabs>
+          <w:tab w:val="num" w:pos="6480"/>
+        </w:tabs>
+        <w:ind w:left="6480" w:hanging="360"/>
+      </w:pPr>
+      <w:rPr>
+        <w:rFonts w:ascii="Wingdings" w:hAnsi="Wingdings" w:hint="default"/>
+        <w:sz w:val="20"/>
+      </w:rPr>
+    </w:lvl>
+  </w:abstractNum>
+  <w:num w:numId="1" w16cid:durableId="762923413">
+    <w:abstractNumId w:val="0"/>
+  </w:num>
+</w:numbering>
 </file>
 
 <file path=word/styles.xml><?xml version="1.0" encoding="utf-8"?>
@@ -964,7 +1417,6 @@
   <w:style w:type="character" w:default="1" w:styleId="DefaultParagraphFont">
     <w:name w:val="Default Paragraph Font"/>
     <w:uiPriority w:val="1"/>
-    <w:semiHidden/>
     <w:unhideWhenUsed/>
   </w:style>
   <w:style w:type="table" w:default="1" w:styleId="TableNormal">

</xml_diff>

<commit_message>
feat: add FastAPI endpoints for upload, prediction, features, and SHAP explanation
</commit_message>
<xml_diff>
--- a/myDocs/step.docx
+++ b/myDocs/step.docx
@@ -4,8 +4,13 @@
   <w:body>
     <w:p>
       <w:r>
-        <w:t>import json</w:t>
-      </w:r>
+        <w:t xml:space="preserve">import </w:t>
+      </w:r>
+      <w:proofErr w:type="spellStart"/>
+      <w:r>
+        <w:t>json</w:t>
+      </w:r>
+      <w:proofErr w:type="spellEnd"/>
     </w:p>
     <w:p>
       <w:r>
@@ -18,13 +23,35 @@
       </w:r>
     </w:p>
     <w:p>
-      <w:r>
-        <w:t>anns = json.load(file)</w:t>
-      </w:r>
-    </w:p>
-    <w:p>
-      <w:r>
-        <w:t>anns.keys()</w:t>
+      <w:proofErr w:type="spellStart"/>
+      <w:r>
+        <w:t>anns</w:t>
+      </w:r>
+      <w:proofErr w:type="spellEnd"/>
+      <w:r>
+        <w:t xml:space="preserve"> = </w:t>
+      </w:r>
+      <w:proofErr w:type="spellStart"/>
+      <w:proofErr w:type="gramStart"/>
+      <w:r>
+        <w:t>json.load</w:t>
+      </w:r>
+      <w:proofErr w:type="spellEnd"/>
+      <w:proofErr w:type="gramEnd"/>
+      <w:r>
+        <w:t>(file)</w:t>
+      </w:r>
+    </w:p>
+    <w:p>
+      <w:proofErr w:type="spellStart"/>
+      <w:proofErr w:type="gramStart"/>
+      <w:r>
+        <w:t>anns.keys</w:t>
+      </w:r>
+      <w:proofErr w:type="spellEnd"/>
+      <w:proofErr w:type="gramEnd"/>
+      <w:r>
+        <w:t>()</w:t>
       </w:r>
     </w:p>
     <w:p/>
@@ -50,8 +77,13 @@
     </w:p>
     <w:p>
       <w:r>
-        <w:t>import json</w:t>
-      </w:r>
+        <w:t xml:space="preserve">import </w:t>
+      </w:r>
+      <w:proofErr w:type="spellStart"/>
+      <w:r>
+        <w:t>json</w:t>
+      </w:r>
+      <w:proofErr w:type="spellEnd"/>
     </w:p>
     <w:p>
       <w:r>
@@ -65,28 +97,83 @@
     </w:p>
     <w:p>
       <w:r>
-        <w:t xml:space="preserve">    caps = json.load(file)</w:t>
+        <w:t xml:space="preserve">    caps = </w:t>
+      </w:r>
+      <w:proofErr w:type="spellStart"/>
+      <w:proofErr w:type="gramStart"/>
+      <w:r>
+        <w:t>json.load</w:t>
+      </w:r>
+      <w:proofErr w:type="spellEnd"/>
+      <w:proofErr w:type="gramEnd"/>
+      <w:r>
+        <w:t>(file)</w:t>
       </w:r>
     </w:p>
     <w:p/>
     <w:p>
-      <w:r>
-        <w:t>image_id = 397133</w:t>
-      </w:r>
-    </w:p>
-    <w:p>
-      <w:r>
-        <w:t>for ann in caps['annotations']:</w:t>
-      </w:r>
-    </w:p>
-    <w:p>
-      <w:r>
-        <w:t xml:space="preserve">    if ann['image_id'] == image_id:</w:t>
-      </w:r>
-    </w:p>
-    <w:p>
-      <w:r>
-        <w:t xml:space="preserve">        print(ann['caption'])</w:t>
+      <w:proofErr w:type="spellStart"/>
+      <w:r>
+        <w:t>image_id</w:t>
+      </w:r>
+      <w:proofErr w:type="spellEnd"/>
+      <w:r>
+        <w:t xml:space="preserve"> = 397133</w:t>
+      </w:r>
+    </w:p>
+    <w:p>
+      <w:r>
+        <w:t xml:space="preserve">for </w:t>
+      </w:r>
+      <w:proofErr w:type="spellStart"/>
+      <w:r>
+        <w:t>ann</w:t>
+      </w:r>
+      <w:proofErr w:type="spellEnd"/>
+      <w:r>
+        <w:t xml:space="preserve"> in caps['annotations']:</w:t>
+      </w:r>
+    </w:p>
+    <w:p>
+      <w:r>
+        <w:t xml:space="preserve">    if </w:t>
+      </w:r>
+      <w:proofErr w:type="spellStart"/>
+      <w:r>
+        <w:t>ann</w:t>
+      </w:r>
+      <w:proofErr w:type="spellEnd"/>
+      <w:r>
+        <w:t>['</w:t>
+      </w:r>
+      <w:proofErr w:type="spellStart"/>
+      <w:r>
+        <w:t>image_id</w:t>
+      </w:r>
+      <w:proofErr w:type="spellEnd"/>
+      <w:r>
+        <w:t xml:space="preserve">'] == </w:t>
+      </w:r>
+      <w:proofErr w:type="spellStart"/>
+      <w:r>
+        <w:t>image_id</w:t>
+      </w:r>
+      <w:proofErr w:type="spellEnd"/>
+      <w:r>
+        <w:t>:</w:t>
+      </w:r>
+    </w:p>
+    <w:p>
+      <w:r>
+        <w:t xml:space="preserve">        print(</w:t>
+      </w:r>
+      <w:proofErr w:type="spellStart"/>
+      <w:r>
+        <w:t>ann</w:t>
+      </w:r>
+      <w:proofErr w:type="spellEnd"/>
+      <w:r>
+        <w:t>['caption'])</w:t>
       </w:r>
     </w:p>
     <w:p/>
@@ -130,35 +217,113 @@
     </w:p>
     <w:p>
       <w:r>
-        <w:t>import matplotlib.pyplot as plt</w:t>
-      </w:r>
+        <w:t xml:space="preserve">import </w:t>
+      </w:r>
+      <w:proofErr w:type="spellStart"/>
+      <w:proofErr w:type="gramStart"/>
+      <w:r>
+        <w:t>matplotlib.pyplot</w:t>
+      </w:r>
+      <w:proofErr w:type="spellEnd"/>
+      <w:proofErr w:type="gramEnd"/>
+      <w:r>
+        <w:t xml:space="preserve"> as </w:t>
+      </w:r>
+      <w:proofErr w:type="spellStart"/>
+      <w:r>
+        <w:t>plt</w:t>
+      </w:r>
+      <w:proofErr w:type="spellEnd"/>
     </w:p>
     <w:p/>
     <w:p>
-      <w:r>
-        <w:t>file_name = '000000397133.jpg'</w:t>
-      </w:r>
-    </w:p>
-    <w:p>
-      <w:r>
-        <w:t>img = Image.open(f'./dataset/val2017/{file_name}')</w:t>
+      <w:proofErr w:type="spellStart"/>
+      <w:r>
+        <w:t>file_name</w:t>
+      </w:r>
+      <w:proofErr w:type="spellEnd"/>
+      <w:r>
+        <w:t xml:space="preserve"> = '000000397133.jpg'</w:t>
+      </w:r>
+    </w:p>
+    <w:p>
+      <w:proofErr w:type="spellStart"/>
+      <w:r>
+        <w:t>img</w:t>
+      </w:r>
+      <w:proofErr w:type="spellEnd"/>
+      <w:r>
+        <w:t xml:space="preserve"> = </w:t>
+      </w:r>
+      <w:proofErr w:type="spellStart"/>
+      <w:r>
+        <w:t>Image.open</w:t>
+      </w:r>
+      <w:proofErr w:type="spellEnd"/>
+      <w:r>
+        <w:t>(f</w:t>
+      </w:r>
+      <w:proofErr w:type="gramStart"/>
+      <w:r>
+        <w:t>'./</w:t>
+      </w:r>
+      <w:proofErr w:type="gramEnd"/>
+      <w:r>
+        <w:t>dataset/val2017/{</w:t>
+      </w:r>
+      <w:proofErr w:type="spellStart"/>
+      <w:r>
+        <w:t>file_name</w:t>
+      </w:r>
+      <w:proofErr w:type="spellEnd"/>
+      <w:r>
+        <w:t>}')</w:t>
       </w:r>
     </w:p>
     <w:p/>
     <w:p>
-      <w:r>
-        <w:t>plt.imshow(img)</w:t>
-      </w:r>
-    </w:p>
-    <w:p>
+      <w:proofErr w:type="spellStart"/>
+      <w:proofErr w:type="gramStart"/>
+      <w:r>
+        <w:t>plt.imshow</w:t>
+      </w:r>
+      <w:proofErr w:type="spellEnd"/>
+      <w:proofErr w:type="gramEnd"/>
+      <w:r>
+        <w:t>(</w:t>
+      </w:r>
+      <w:proofErr w:type="spellStart"/>
+      <w:r>
+        <w:t>img</w:t>
+      </w:r>
+      <w:proofErr w:type="spellEnd"/>
+      <w:r>
+        <w:t>)</w:t>
+      </w:r>
+    </w:p>
+    <w:p>
+      <w:proofErr w:type="spellStart"/>
+      <w:proofErr w:type="gramStart"/>
       <w:r>
         <w:lastRenderedPageBreak/>
-        <w:t>plt.axis('off')</w:t>
-      </w:r>
-    </w:p>
-    <w:p>
-      <w:r>
-        <w:t>plt.show()</w:t>
+        <w:t>plt.axis</w:t>
+      </w:r>
+      <w:proofErr w:type="spellEnd"/>
+      <w:proofErr w:type="gramEnd"/>
+      <w:r>
+        <w:t>('off')</w:t>
+      </w:r>
+    </w:p>
+    <w:p>
+      <w:proofErr w:type="spellStart"/>
+      <w:proofErr w:type="gramStart"/>
+      <w:r>
+        <w:t>plt.show</w:t>
+      </w:r>
+      <w:proofErr w:type="spellEnd"/>
+      <w:proofErr w:type="gramEnd"/>
+      <w:r>
+        <w:t>()</w:t>
       </w:r>
     </w:p>
     <w:p/>
@@ -176,11 +341,13 @@
       <w:r>
         <w:t xml:space="preserve">STEP </w:t>
       </w:r>
-      <w:r>
-        <w:t>3</w:t>
-      </w:r>
-      <w:r>
-        <w:t xml:space="preserve"> :  </w:t>
+      <w:proofErr w:type="gramStart"/>
+      <w:r>
+        <w:t>3 :</w:t>
+      </w:r>
+      <w:proofErr w:type="gramEnd"/>
+      <w:r>
+        <w:t xml:space="preserve">  </w:t>
       </w:r>
       <w:r>
         <w:tab/>
@@ -191,30 +358,37 @@
     </w:p>
     <w:p>
       <w:r>
-        <w:t xml:space="preserve">STEP 4 :  </w:t>
+        <w:t xml:space="preserve">STEP </w:t>
+      </w:r>
+      <w:proofErr w:type="gramStart"/>
+      <w:r>
+        <w:t>4 :</w:t>
+      </w:r>
+      <w:proofErr w:type="gramEnd"/>
+      <w:r>
+        <w:t xml:space="preserve">  </w:t>
       </w:r>
       <w:r>
         <w:tab/>
       </w:r>
       <w:r>
+        <w:t xml:space="preserve"> python src/caption_diversity.py</w:t>
+      </w:r>
+      <w:r>
         <w:t xml:space="preserve"> </w:t>
       </w:r>
-      <w:r>
-        <w:t>python src/caption_diversity.py</w:t>
-      </w:r>
-      <w:r>
-        <w:t xml:space="preserve"> </w:t>
-      </w:r>
     </w:p>
     <w:p>
       <w:r>
         <w:t xml:space="preserve">STEP </w:t>
       </w:r>
-      <w:r>
-        <w:t xml:space="preserve">5 </w:t>
-      </w:r>
-      <w:r>
-        <w:t xml:space="preserve">:  </w:t>
+      <w:proofErr w:type="gramStart"/>
+      <w:r>
+        <w:t>5 :</w:t>
+      </w:r>
+      <w:proofErr w:type="gramEnd"/>
+      <w:r>
+        <w:t xml:space="preserve">  </w:t>
       </w:r>
       <w:r>
         <w:tab/>
@@ -231,13 +405,15 @@
         </w:rPr>
       </w:pPr>
       <w:r>
-        <w:t>STEP</w:t>
-      </w:r>
-      <w:r>
-        <w:t xml:space="preserve"> 6 </w:t>
-      </w:r>
-      <w:r>
-        <w:t xml:space="preserve">:  </w:t>
+        <w:t xml:space="preserve">STEP </w:t>
+      </w:r>
+      <w:proofErr w:type="gramStart"/>
+      <w:r>
+        <w:t>6 :</w:t>
+      </w:r>
+      <w:proofErr w:type="gramEnd"/>
+      <w:r>
+        <w:t xml:space="preserve">  </w:t>
       </w:r>
       <w:r>
         <w:tab/>
@@ -264,12 +440,11 @@
       <w:r>
         <w:t xml:space="preserve">STEP </w:t>
       </w:r>
-      <w:r>
-        <w:t>7</w:t>
-      </w:r>
-      <w:r>
-        <w:t xml:space="preserve"> :</w:t>
-      </w:r>
+      <w:proofErr w:type="gramStart"/>
+      <w:r>
+        <w:t>7 :</w:t>
+      </w:r>
+      <w:proofErr w:type="gramEnd"/>
       <w:r>
         <w:tab/>
       </w:r>
@@ -287,8 +462,13 @@
         <w:spacing w:after="0" w:line="240" w:lineRule="auto"/>
       </w:pPr>
       <w:r>
-        <w:t>STEP 8 :</w:t>
-      </w:r>
+        <w:t xml:space="preserve">STEP </w:t>
+      </w:r>
+      <w:proofErr w:type="gramStart"/>
+      <w:r>
+        <w:t>8 :</w:t>
+      </w:r>
+      <w:proofErr w:type="gramEnd"/>
       <w:r>
         <w:tab/>
       </w:r>
@@ -312,6 +492,7 @@
       <w:r>
         <w:rPr>
           <w:rFonts w:ascii="Times New Roman" w:hAnsi="Times New Roman" w:cs="Times New Roman"/>
+          <w:noProof/>
         </w:rPr>
         <w:drawing>
           <wp:inline distT="0" distB="0" distL="0" distR="0" wp14:anchorId="1561D513" wp14:editId="39639F2D">
@@ -329,7 +510,7 @@
                     <pic:cNvPicPr/>
                   </pic:nvPicPr>
                   <pic:blipFill>
-                    <a:blip r:embed="rId4"/>
+                    <a:blip r:embed="rId5"/>
                     <a:stretch>
                       <a:fillRect/>
                     </a:stretch>
@@ -351,6 +532,689 @@
       </w:r>
     </w:p>
     <w:p/>
+    <w:p/>
+    <w:p/>
+    <w:p/>
+    <w:p>
+      <w:pPr>
+        <w:rPr>
+          <w:rFonts w:ascii="Times New Roman" w:hAnsi="Times New Roman" w:cs="Times New Roman"/>
+          <w:b/>
+          <w:bCs/>
+        </w:rPr>
+      </w:pPr>
+      <w:r>
+        <w:lastRenderedPageBreak/>
+        <w:t>STEP 9:</w:t>
+      </w:r>
+      <w:r>
+        <w:t xml:space="preserve"> </w:t>
+      </w:r>
+      <w:r>
+        <w:rPr>
+          <w:rFonts w:ascii="Times New Roman" w:hAnsi="Times New Roman" w:cs="Times New Roman"/>
+          <w:b/>
+          <w:bCs/>
+        </w:rPr>
+        <w:t>SHAP</w:t>
+      </w:r>
+    </w:p>
+    <w:p>
+      <w:r>
+        <w:t>python src/shap_analysis.py</w:t>
+      </w:r>
+    </w:p>
+    <w:p>
+      <w:r>
+        <w:t>I built the </w:t>
+      </w:r>
+      <w:r>
+        <w:rPr>
+          <w:b/>
+          <w:bCs/>
+        </w:rPr>
+        <w:t>SHAP explainability module</w:t>
+      </w:r>
+      <w:r>
+        <w:t> as requested, but hit a significant environment obstacle along the way worth flagging.</w:t>
+      </w:r>
+    </w:p>
+    <w:p>
+      <w:pPr>
+        <w:rPr>
+          <w:b/>
+          <w:bCs/>
+        </w:rPr>
+      </w:pPr>
+      <w:r>
+        <w:rPr>
+          <w:b/>
+          <w:bCs/>
+        </w:rPr>
+        <w:t xml:space="preserve">The blocker: </w:t>
+      </w:r>
+      <w:proofErr w:type="spellStart"/>
+      <w:r>
+        <w:rPr>
+          <w:b/>
+          <w:bCs/>
+        </w:rPr>
+        <w:t>numba</w:t>
+      </w:r>
+      <w:proofErr w:type="spellEnd"/>
+      <w:r>
+        <w:rPr>
+          <w:b/>
+          <w:bCs/>
+        </w:rPr>
+        <w:t xml:space="preserve"> blocked by Windows Application Control policy</w:t>
+      </w:r>
+    </w:p>
+    <w:p>
+      <w:proofErr w:type="spellStart"/>
+      <w:r>
+        <w:t>shap</w:t>
+      </w:r>
+      <w:proofErr w:type="spellEnd"/>
+      <w:r>
+        <w:t> unconditionally imports </w:t>
+      </w:r>
+      <w:proofErr w:type="spellStart"/>
+      <w:r>
+        <w:t>numba</w:t>
+      </w:r>
+      <w:proofErr w:type="spellEnd"/>
+      <w:r>
+        <w:t xml:space="preserve"> at package </w:t>
+      </w:r>
+      <w:proofErr w:type="spellStart"/>
+      <w:r>
+        <w:t>init</w:t>
+      </w:r>
+      <w:proofErr w:type="spellEnd"/>
+      <w:r>
+        <w:t xml:space="preserve"> (for a few clustering helpers used only by some plotting utilities), but on this machine, import </w:t>
+      </w:r>
+      <w:proofErr w:type="spellStart"/>
+      <w:r>
+        <w:t>numba</w:t>
+      </w:r>
+      <w:proofErr w:type="spellEnd"/>
+      <w:r>
+        <w:t> fails outright:</w:t>
+      </w:r>
+    </w:p>
+    <w:p>
+      <w:proofErr w:type="spellStart"/>
+      <w:r>
+        <w:t>ImportError</w:t>
+      </w:r>
+      <w:proofErr w:type="spellEnd"/>
+      <w:r>
+        <w:t>: DLL load failed while importing _</w:t>
+      </w:r>
+      <w:proofErr w:type="spellStart"/>
+      <w:r>
+        <w:t>devicearray</w:t>
+      </w:r>
+      <w:proofErr w:type="spellEnd"/>
+      <w:r>
+        <w:t>: An Application Control policy has blocked this file.</w:t>
+      </w:r>
+    </w:p>
+    <w:p>
+      <w:r>
+        <w:t xml:space="preserve">This is an OS-level security policy blocking </w:t>
+      </w:r>
+      <w:proofErr w:type="spellStart"/>
+      <w:r>
+        <w:t>numba's</w:t>
+      </w:r>
+      <w:proofErr w:type="spellEnd"/>
+      <w:r>
+        <w:t xml:space="preserve"> native extensions — reinstalling </w:t>
+      </w:r>
+      <w:proofErr w:type="spellStart"/>
+      <w:r>
+        <w:t>numba</w:t>
+      </w:r>
+      <w:proofErr w:type="spellEnd"/>
+      <w:r>
+        <w:t xml:space="preserve"> didn't help, confirming it's not a corrupted install. Since </w:t>
+      </w:r>
+      <w:proofErr w:type="spellStart"/>
+      <w:r>
+        <w:t>numba</w:t>
+      </w:r>
+      <w:proofErr w:type="spellEnd"/>
+      <w:r>
+        <w:t xml:space="preserve"> isn't actually needed for </w:t>
+      </w:r>
+      <w:proofErr w:type="spellStart"/>
+      <w:r>
+        <w:t>TreeExplainer</w:t>
+      </w:r>
+      <w:proofErr w:type="spellEnd"/>
+      <w:r>
+        <w:t> (only for </w:t>
+      </w:r>
+      <w:proofErr w:type="spellStart"/>
+      <w:r>
+        <w:t>njit</w:t>
+      </w:r>
+      <w:proofErr w:type="spellEnd"/>
+      <w:r>
+        <w:t>-decorated hierarchical-clustering helpers and </w:t>
+      </w:r>
+      <w:proofErr w:type="spellStart"/>
+      <w:proofErr w:type="gramStart"/>
+      <w:r>
+        <w:t>numba.typed</w:t>
+      </w:r>
+      <w:proofErr w:type="gramEnd"/>
+      <w:r>
+        <w:t>.List</w:t>
+      </w:r>
+      <w:proofErr w:type="spellEnd"/>
+      <w:r>
+        <w:t xml:space="preserve"> elsewhere in </w:t>
+      </w:r>
+      <w:proofErr w:type="spellStart"/>
+      <w:r>
+        <w:t>shap</w:t>
+      </w:r>
+      <w:proofErr w:type="spellEnd"/>
+      <w:r>
+        <w:t>), I wrote a </w:t>
+      </w:r>
+      <w:r>
+        <w:rPr>
+          <w:b/>
+          <w:bCs/>
+        </w:rPr>
+        <w:t>pure-Python compatibility shim</w:t>
+      </w:r>
+      <w:r>
+        <w:t> (</w:t>
+      </w:r>
+      <w:proofErr w:type="spellStart"/>
+      <w:r>
+        <w:t>image_ambiguity</w:t>
+      </w:r>
+      <w:proofErr w:type="spellEnd"/>
+      <w:r>
+        <w:t>/explainability/numba_stub.py) that installs a no-op stand-in for </w:t>
+      </w:r>
+      <w:proofErr w:type="spellStart"/>
+      <w:r>
+        <w:t>numba</w:t>
+      </w:r>
+      <w:proofErr w:type="spellEnd"/>
+      <w:r>
+        <w:t> only when the real one can't load — making @njit an identity decorator and </w:t>
+      </w:r>
+      <w:proofErr w:type="spellStart"/>
+      <w:r>
+        <w:t>numba.typed.List</w:t>
+      </w:r>
+      <w:proofErr w:type="spellEnd"/>
+      <w:r>
+        <w:t xml:space="preserve"> an alias for list. This </w:t>
+      </w:r>
+      <w:proofErr w:type="gramStart"/>
+      <w:r>
+        <w:t>lets</w:t>
+      </w:r>
+      <w:proofErr w:type="gramEnd"/>
+      <w:r>
+        <w:t xml:space="preserve"> import </w:t>
+      </w:r>
+      <w:proofErr w:type="spellStart"/>
+      <w:r>
+        <w:t>shap</w:t>
+      </w:r>
+      <w:proofErr w:type="spellEnd"/>
+      <w:r>
+        <w:t> succeed with zero loss of correctness (just no JIT speedup, irrelevant for our small dataset).</w:t>
+      </w:r>
+    </w:p>
+    <w:p>
+      <w:pPr>
+        <w:rPr>
+          <w:b/>
+          <w:bCs/>
+        </w:rPr>
+      </w:pPr>
+      <w:r>
+        <w:rPr>
+          <w:b/>
+          <w:bCs/>
+        </w:rPr>
+        <w:t>What was built</w:t>
+      </w:r>
+    </w:p>
+    <w:p>
+      <w:r>
+        <w:rPr>
+          <w:b/>
+          <w:bCs/>
+        </w:rPr>
+        <w:t>SHAPExplainer</w:t>
+      </w:r>
+      <w:r>
+        <w:t> (image_ambiguity/explainability/shap_explainer.py):</w:t>
+      </w:r>
+    </w:p>
+    <w:p>
+      <w:pPr>
+        <w:numPr>
+          <w:ilvl w:val="0"/>
+          <w:numId w:val="1"/>
+        </w:numPr>
+      </w:pPr>
+      <w:proofErr w:type="spellStart"/>
+      <w:r>
+        <w:t>compute_shap_</w:t>
+      </w:r>
+      <w:proofErr w:type="gramStart"/>
+      <w:r>
+        <w:t>values</w:t>
+      </w:r>
+      <w:proofErr w:type="spellEnd"/>
+      <w:r>
+        <w:t>(</w:t>
+      </w:r>
+      <w:proofErr w:type="gramEnd"/>
+      <w:r>
+        <w:t>) — wraps </w:t>
+      </w:r>
+      <w:proofErr w:type="spellStart"/>
+      <w:r>
+        <w:t>shap.TreeExplainer</w:t>
+      </w:r>
+      <w:proofErr w:type="spellEnd"/>
+    </w:p>
+    <w:p>
+      <w:pPr>
+        <w:numPr>
+          <w:ilvl w:val="0"/>
+          <w:numId w:val="1"/>
+        </w:numPr>
+      </w:pPr>
+      <w:proofErr w:type="spellStart"/>
+      <w:r>
+        <w:t>top_feature_</w:t>
+      </w:r>
+      <w:proofErr w:type="gramStart"/>
+      <w:r>
+        <w:t>importance</w:t>
+      </w:r>
+      <w:proofErr w:type="spellEnd"/>
+      <w:r>
+        <w:t>(</w:t>
+      </w:r>
+      <w:proofErr w:type="gramEnd"/>
+      <w:r>
+        <w:t>) + </w:t>
+      </w:r>
+      <w:proofErr w:type="spellStart"/>
+      <w:r>
+        <w:t>plot_top_feature_importance</w:t>
+      </w:r>
+      <w:proofErr w:type="spellEnd"/>
+      <w:r>
+        <w:t>() — mean |SHAP value| ranking, bar chart</w:t>
+      </w:r>
+    </w:p>
+    <w:p>
+      <w:pPr>
+        <w:numPr>
+          <w:ilvl w:val="0"/>
+          <w:numId w:val="1"/>
+        </w:numPr>
+      </w:pPr>
+      <w:proofErr w:type="spellStart"/>
+      <w:r>
+        <w:t>summary_</w:t>
+      </w:r>
+      <w:proofErr w:type="gramStart"/>
+      <w:r>
+        <w:t>plot</w:t>
+      </w:r>
+      <w:proofErr w:type="spellEnd"/>
+      <w:r>
+        <w:t>(</w:t>
+      </w:r>
+      <w:proofErr w:type="gramEnd"/>
+      <w:r>
+        <w:t xml:space="preserve">) — </w:t>
+      </w:r>
+      <w:proofErr w:type="spellStart"/>
+      <w:r>
+        <w:t>beeswarm</w:t>
+      </w:r>
+      <w:proofErr w:type="spellEnd"/>
+      <w:r>
+        <w:t xml:space="preserve"> plot for a chosen class</w:t>
+      </w:r>
+    </w:p>
+    <w:p>
+      <w:pPr>
+        <w:numPr>
+          <w:ilvl w:val="0"/>
+          <w:numId w:val="1"/>
+        </w:numPr>
+      </w:pPr>
+      <w:proofErr w:type="spellStart"/>
+      <w:r>
+        <w:t>waterfall_</w:t>
+      </w:r>
+      <w:proofErr w:type="gramStart"/>
+      <w:r>
+        <w:t>plot</w:t>
+      </w:r>
+      <w:proofErr w:type="spellEnd"/>
+      <w:r>
+        <w:t>(</w:t>
+      </w:r>
+      <w:proofErr w:type="gramEnd"/>
+      <w:r>
+        <w:t>) — single-prediction waterfall</w:t>
+      </w:r>
+    </w:p>
+    <w:p>
+      <w:pPr>
+        <w:numPr>
+          <w:ilvl w:val="0"/>
+          <w:numId w:val="1"/>
+        </w:numPr>
+      </w:pPr>
+      <w:proofErr w:type="spellStart"/>
+      <w:r>
+        <w:t>force_</w:t>
+      </w:r>
+      <w:proofErr w:type="gramStart"/>
+      <w:r>
+        <w:t>plot</w:t>
+      </w:r>
+      <w:proofErr w:type="spellEnd"/>
+      <w:r>
+        <w:t>(</w:t>
+      </w:r>
+      <w:proofErr w:type="gramEnd"/>
+      <w:r>
+        <w:t>) — static matplotlib force plot (rounded value labels for legibility)</w:t>
+      </w:r>
+    </w:p>
+    <w:p>
+      <w:pPr>
+        <w:numPr>
+          <w:ilvl w:val="0"/>
+          <w:numId w:val="1"/>
+        </w:numPr>
+      </w:pPr>
+      <w:proofErr w:type="spellStart"/>
+      <w:r>
+        <w:t>explain_</w:t>
+      </w:r>
+      <w:proofErr w:type="gramStart"/>
+      <w:r>
+        <w:t>prediction</w:t>
+      </w:r>
+      <w:proofErr w:type="spellEnd"/>
+      <w:r>
+        <w:t>(</w:t>
+      </w:r>
+      <w:proofErr w:type="gramEnd"/>
+      <w:r>
+        <w:t>) → </w:t>
+      </w:r>
+      <w:proofErr w:type="spellStart"/>
+      <w:r>
+        <w:t>PredictionExplanation</w:t>
+      </w:r>
+      <w:proofErr w:type="spellEnd"/>
+      <w:r>
+        <w:t> — structured, human-readable top-feature breakdown</w:t>
+      </w:r>
+    </w:p>
+    <w:p>
+      <w:r>
+        <w:rPr>
+          <w:b/>
+          <w:bCs/>
+        </w:rPr>
+        <w:t>Runnable script</w:t>
+      </w:r>
+      <w:r>
+        <w:t>: src/shap_analysis.py — loads models/</w:t>
+      </w:r>
+      <w:proofErr w:type="spellStart"/>
+      <w:r>
+        <w:t>random_forest.joblib</w:t>
+      </w:r>
+      <w:proofErr w:type="spellEnd"/>
+      <w:r>
+        <w:t> + human_dataset.csv, generates all four plots, and explains one prediction.</w:t>
+      </w:r>
+    </w:p>
+    <w:p>
+      <w:r>
+        <w:rPr>
+          <w:b/>
+          <w:bCs/>
+        </w:rPr>
+        <w:t>Test run</w:t>
+      </w:r>
+      <w:r>
+        <w:t xml:space="preserve"> (python </w:t>
+      </w:r>
+      <w:proofErr w:type="spellStart"/>
+      <w:r>
+        <w:t>src</w:t>
+      </w:r>
+      <w:proofErr w:type="spellEnd"/>
+      <w:r>
+        <w:t>/shap_analysis.py) — top features are </w:t>
+      </w:r>
+      <w:proofErr w:type="spellStart"/>
+      <w:r>
+        <w:rPr>
+          <w:b/>
+          <w:bCs/>
+        </w:rPr>
+        <w:t>average_similarity</w:t>
+      </w:r>
+      <w:proofErr w:type="spellEnd"/>
+      <w:r>
+        <w:t> and </w:t>
+      </w:r>
+      <w:proofErr w:type="spellStart"/>
+      <w:r>
+        <w:rPr>
+          <w:b/>
+          <w:bCs/>
+        </w:rPr>
+        <w:t>caption_diversity</w:t>
+      </w:r>
+      <w:proofErr w:type="spellEnd"/>
+      <w:r>
+        <w:t xml:space="preserve">, dwarfing all OpenCV features, which is the expected/consistent story from earlier modules (the label is literally derived </w:t>
+      </w:r>
+      <w:r>
+        <w:lastRenderedPageBreak/>
+        <w:t>from </w:t>
+      </w:r>
+      <w:proofErr w:type="spellStart"/>
+      <w:r>
+        <w:t>caption_diversity</w:t>
+      </w:r>
+      <w:proofErr w:type="spellEnd"/>
+      <w:r>
+        <w:t>). It explained image 425227, predicted </w:t>
+      </w:r>
+      <w:r>
+        <w:rPr>
+          <w:b/>
+          <w:bCs/>
+        </w:rPr>
+        <w:t>High</w:t>
+      </w:r>
+      <w:r>
+        <w:t> ambiguity at 72% probability, driven mainly by high </w:t>
+      </w:r>
+      <w:proofErr w:type="spellStart"/>
+      <w:r>
+        <w:t>caption_diversity</w:t>
+      </w:r>
+      <w:proofErr w:type="spellEnd"/>
+      <w:r>
+        <w:t> (0.72) and low </w:t>
+      </w:r>
+      <w:proofErr w:type="spellStart"/>
+      <w:r>
+        <w:t>average_similarity</w:t>
+      </w:r>
+      <w:proofErr w:type="spellEnd"/>
+      <w:r>
+        <w:t> (0.28).</w:t>
+      </w:r>
+    </w:p>
+    <w:p>
+      <w:r>
+        <w:rPr>
+          <w:b/>
+          <w:bCs/>
+        </w:rPr>
+        <w:t>Tests</w:t>
+      </w:r>
+      <w:r>
+        <w:t>: test_numba_stub.py (6 tests) + test_shap_explainer.py (16 tests). Full suite: </w:t>
+      </w:r>
+      <w:r>
+        <w:rPr>
+          <w:b/>
+          <w:bCs/>
+        </w:rPr>
+        <w:t>132 passed</w:t>
+      </w:r>
+      <w:r>
+        <w:t>, no linter errors.</w:t>
+      </w:r>
+    </w:p>
+    <w:p>
+      <w:pPr>
+        <w:rPr>
+          <w:b/>
+          <w:bCs/>
+        </w:rPr>
+      </w:pPr>
+      <w:r>
+        <w:rPr>
+          <w:b/>
+          <w:bCs/>
+        </w:rPr>
+        <w:t>Design note</w:t>
+      </w:r>
+    </w:p>
+    <w:p>
+      <w:r>
+        <w:t>explainability is </w:t>
+      </w:r>
+      <w:r>
+        <w:rPr>
+          <w:b/>
+          <w:bCs/>
+        </w:rPr>
+        <w:t>not</w:t>
+      </w:r>
+      <w:r>
+        <w:t xml:space="preserve"> re-exported from the top-level image_ambiguity/__init__.py — importing it triggers the </w:t>
+      </w:r>
+      <w:proofErr w:type="spellStart"/>
+      <w:r>
+        <w:t>numba</w:t>
+      </w:r>
+      <w:proofErr w:type="spellEnd"/>
+      <w:r>
+        <w:t xml:space="preserve"> probe + </w:t>
+      </w:r>
+      <w:proofErr w:type="spellStart"/>
+      <w:r>
+        <w:t>shap</w:t>
+      </w:r>
+      <w:proofErr w:type="spellEnd"/>
+      <w:r>
+        <w:t xml:space="preserve"> import, which adds real startup cost that unrelated scripts (COCO loading, training, etc.) shouldn't pay every time. It's opt-in via from </w:t>
+      </w:r>
+      <w:proofErr w:type="spellStart"/>
+      <w:r>
+        <w:t>image_</w:t>
+      </w:r>
+      <w:proofErr w:type="gramStart"/>
+      <w:r>
+        <w:t>ambiguity.explainability</w:t>
+      </w:r>
+      <w:proofErr w:type="spellEnd"/>
+      <w:proofErr w:type="gramEnd"/>
+      <w:r>
+        <w:t xml:space="preserve"> import </w:t>
+      </w:r>
+      <w:proofErr w:type="spellStart"/>
+      <w:r>
+        <w:t>SHAPExplainer</w:t>
+      </w:r>
+      <w:proofErr w:type="spellEnd"/>
+      <w:r>
+        <w:t>.</w:t>
+      </w:r>
+    </w:p>
+    <w:p>
+      <w:r>
+        <w:t>Nothing has been committed yet — let me know if you'd like a commit message for this.</w:t>
+      </w:r>
+    </w:p>
+    <w:p/>
+    <w:p/>
+    <w:p>
+      <w:pPr>
+        <w:spacing w:after="0" w:line="240" w:lineRule="auto"/>
+        <w:rPr>
+          <w:rFonts w:ascii="Times New Roman" w:hAnsi="Times New Roman" w:cs="Times New Roman"/>
+        </w:rPr>
+      </w:pPr>
+      <w:r>
+        <w:rPr>
+          <w:rFonts w:ascii="Times New Roman" w:hAnsi="Times New Roman" w:cs="Times New Roman"/>
+          <w:b/>
+          <w:bCs/>
+        </w:rPr>
+        <w:t xml:space="preserve"> STEP </w:t>
+      </w:r>
+      <w:proofErr w:type="gramStart"/>
+      <w:r>
+        <w:rPr>
+          <w:rFonts w:ascii="Times New Roman" w:hAnsi="Times New Roman" w:cs="Times New Roman"/>
+          <w:b/>
+          <w:bCs/>
+        </w:rPr>
+        <w:t>10</w:t>
+      </w:r>
+      <w:r>
+        <w:rPr>
+          <w:rFonts w:ascii="Times New Roman" w:hAnsi="Times New Roman" w:cs="Times New Roman"/>
+        </w:rPr>
+        <w:t xml:space="preserve"> :</w:t>
+      </w:r>
+      <w:proofErr w:type="gramEnd"/>
+      <w:r>
+        <w:rPr>
+          <w:rFonts w:ascii="Times New Roman" w:hAnsi="Times New Roman" w:cs="Times New Roman"/>
+        </w:rPr>
+        <w:t xml:space="preserve"> src/blip_caption.py</w:t>
+      </w:r>
+    </w:p>
+    <w:p/>
     <w:sectPr>
       <w:pgSz w:w="11906" w:h="16838"/>
       <w:pgMar w:top="1440" w:right="1440" w:bottom="1440" w:left="1440" w:header="708" w:footer="708" w:gutter="0"/>
@@ -359,6 +1223,163 @@
     </w:sectPr>
   </w:body>
 </w:document>
+</file>
+
+<file path=word/numbering.xml><?xml version="1.0" encoding="utf-8"?>
+<w:numbering xmlns:wpc="http://schemas.microsoft.com/office/word/2010/wordprocessingCanvas" xmlns:cx="http://schemas.microsoft.com/office/drawing/2014/chartex" xmlns:cx1="http://schemas.microsoft.com/office/drawing/2015/9/8/chartex" xmlns:cx2="http://schemas.microsoft.com/office/drawing/2015/10/21/chartex" xmlns:cx3="http://schemas.microsoft.com/office/drawing/2016/5/9/chartex" xmlns:cx4="http://schemas.microsoft.com/office/drawing/2016/5/10/chartex" xmlns:cx5="http://schemas.microsoft.com/office/drawing/2016/5/11/chartex" xmlns:cx6="http://schemas.microsoft.com/office/drawing/2016/5/12/chartex" xmlns:cx7="http://schemas.microsoft.com/office/drawing/2016/5/13/chartex" xmlns:cx8="http://schemas.microsoft.com/office/drawing/2016/5/14/chartex" xmlns:mc="http://schemas.openxmlformats.org/markup-compatibility/2006" xmlns:aink="http://schemas.microsoft.com/office/drawing/2016/ink" xmlns:am3d="http://schemas.microsoft.com/office/drawing/2017/model3d" xmlns:o="urn:schemas-microsoft-com:office:office" xmlns:oel="http://schemas.microsoft.com/office/2019/extlst" xmlns:r="http://schemas.openxmlformats.org/officeDocument/2006/relationships" xmlns:m="http://schemas.openxmlformats.org/officeDocument/2006/math" xmlns:v="urn:schemas-microsoft-com:vml" xmlns:wp14="http://schemas.microsoft.com/office/word/2010/wordprocessingDrawing" xmlns:wp="http://schemas.openxmlformats.org/drawingml/2006/wordprocessingDrawing" xmlns:w10="urn:schemas-microsoft-com:office:word" xmlns:w="http://schemas.openxmlformats.org/wordprocessingml/2006/main" xmlns:w14="http://schemas.microsoft.com/office/word/2010/wordml" xmlns:w15="http://schemas.microsoft.com/office/word/2012/wordml" xmlns:w16cex="http://schemas.microsoft.com/office/word/2018/wordml/cex" xmlns:w16cid="http://schemas.microsoft.com/office/word/2016/wordml/cid" xmlns:w16="http://schemas.microsoft.com/office/word/2018/wordml" xmlns:w16du="http://schemas.microsoft.com/office/word/2023/wordml/word16du" xmlns:w16sdtdh="http://schemas.microsoft.com/office/word/2020/wordml/sdtdatahash" xmlns:w16sdtfl="http://schemas.microsoft.com/office/word/2024/wordml/sdtformatlock" xmlns:w16se="http://schemas.microsoft.com/office/word/2015/wordml/symex" xmlns:wpg="http://schemas.microsoft.com/office/word/2010/wordprocessingGroup" xmlns:wpi="http://schemas.microsoft.com/office/word/2010/wordprocessingInk" xmlns:wne="http://schemas.microsoft.com/office/word/2006/wordml" xmlns:wps="http://schemas.microsoft.com/office/word/2010/wordprocessingShape" mc:Ignorable="w14 w15 w16se w16cid w16 w16cex w16sdtdh w16sdtfl w16du wp14">
+  <w:abstractNum w:abstractNumId="0" w15:restartNumberingAfterBreak="0">
+    <w:nsid w:val="53A7730B"/>
+    <w:multiLevelType w:val="multilevel"/>
+    <w:tmpl w:val="6CDA7C92"/>
+    <w:lvl w:ilvl="0">
+      <w:start w:val="1"/>
+      <w:numFmt w:val="bullet"/>
+      <w:lvlText w:val=""/>
+      <w:lvlJc w:val="left"/>
+      <w:pPr>
+        <w:tabs>
+          <w:tab w:val="num" w:pos="720"/>
+        </w:tabs>
+        <w:ind w:left="720" w:hanging="360"/>
+      </w:pPr>
+      <w:rPr>
+        <w:rFonts w:ascii="Symbol" w:hAnsi="Symbol" w:hint="default"/>
+        <w:sz w:val="20"/>
+      </w:rPr>
+    </w:lvl>
+    <w:lvl w:ilvl="1" w:tentative="1">
+      <w:start w:val="1"/>
+      <w:numFmt w:val="bullet"/>
+      <w:lvlText w:val="o"/>
+      <w:lvlJc w:val="left"/>
+      <w:pPr>
+        <w:tabs>
+          <w:tab w:val="num" w:pos="1440"/>
+        </w:tabs>
+        <w:ind w:left="1440" w:hanging="360"/>
+      </w:pPr>
+      <w:rPr>
+        <w:rFonts w:ascii="Courier New" w:hAnsi="Courier New" w:hint="default"/>
+        <w:sz w:val="20"/>
+      </w:rPr>
+    </w:lvl>
+    <w:lvl w:ilvl="2" w:tentative="1">
+      <w:start w:val="1"/>
+      <w:numFmt w:val="bullet"/>
+      <w:lvlText w:val=""/>
+      <w:lvlJc w:val="left"/>
+      <w:pPr>
+        <w:tabs>
+          <w:tab w:val="num" w:pos="2160"/>
+        </w:tabs>
+        <w:ind w:left="2160" w:hanging="360"/>
+      </w:pPr>
+      <w:rPr>
+        <w:rFonts w:ascii="Wingdings" w:hAnsi="Wingdings" w:hint="default"/>
+        <w:sz w:val="20"/>
+      </w:rPr>
+    </w:lvl>
+    <w:lvl w:ilvl="3" w:tentative="1">
+      <w:start w:val="1"/>
+      <w:numFmt w:val="bullet"/>
+      <w:lvlText w:val=""/>
+      <w:lvlJc w:val="left"/>
+      <w:pPr>
+        <w:tabs>
+          <w:tab w:val="num" w:pos="2880"/>
+        </w:tabs>
+        <w:ind w:left="2880" w:hanging="360"/>
+      </w:pPr>
+      <w:rPr>
+        <w:rFonts w:ascii="Wingdings" w:hAnsi="Wingdings" w:hint="default"/>
+        <w:sz w:val="20"/>
+      </w:rPr>
+    </w:lvl>
+    <w:lvl w:ilvl="4" w:tentative="1">
+      <w:start w:val="1"/>
+      <w:numFmt w:val="bullet"/>
+      <w:lvlText w:val=""/>
+      <w:lvlJc w:val="left"/>
+      <w:pPr>
+        <w:tabs>
+          <w:tab w:val="num" w:pos="3600"/>
+        </w:tabs>
+        <w:ind w:left="3600" w:hanging="360"/>
+      </w:pPr>
+      <w:rPr>
+        <w:rFonts w:ascii="Wingdings" w:hAnsi="Wingdings" w:hint="default"/>
+        <w:sz w:val="20"/>
+      </w:rPr>
+    </w:lvl>
+    <w:lvl w:ilvl="5" w:tentative="1">
+      <w:start w:val="1"/>
+      <w:numFmt w:val="bullet"/>
+      <w:lvlText w:val=""/>
+      <w:lvlJc w:val="left"/>
+      <w:pPr>
+        <w:tabs>
+          <w:tab w:val="num" w:pos="4320"/>
+        </w:tabs>
+        <w:ind w:left="4320" w:hanging="360"/>
+      </w:pPr>
+      <w:rPr>
+        <w:rFonts w:ascii="Wingdings" w:hAnsi="Wingdings" w:hint="default"/>
+        <w:sz w:val="20"/>
+      </w:rPr>
+    </w:lvl>
+    <w:lvl w:ilvl="6" w:tentative="1">
+      <w:start w:val="1"/>
+      <w:numFmt w:val="bullet"/>
+      <w:lvlText w:val=""/>
+      <w:lvlJc w:val="left"/>
+      <w:pPr>
+        <w:tabs>
+          <w:tab w:val="num" w:pos="5040"/>
+        </w:tabs>
+        <w:ind w:left="5040" w:hanging="360"/>
+      </w:pPr>
+      <w:rPr>
+        <w:rFonts w:ascii="Wingdings" w:hAnsi="Wingdings" w:hint="default"/>
+        <w:sz w:val="20"/>
+      </w:rPr>
+    </w:lvl>
+    <w:lvl w:ilvl="7" w:tentative="1">
+      <w:start w:val="1"/>
+      <w:numFmt w:val="bullet"/>
+      <w:lvlText w:val=""/>
+      <w:lvlJc w:val="left"/>
+      <w:pPr>
+        <w:tabs>
+          <w:tab w:val="num" w:pos="5760"/>
+        </w:tabs>
+        <w:ind w:left="5760" w:hanging="360"/>
+      </w:pPr>
+      <w:rPr>
+        <w:rFonts w:ascii="Wingdings" w:hAnsi="Wingdings" w:hint="default"/>
+        <w:sz w:val="20"/>
+      </w:rPr>
+    </w:lvl>
+    <w:lvl w:ilvl="8" w:tentative="1">
+      <w:start w:val="1"/>
+      <w:numFmt w:val="bullet"/>
+      <w:lvlText w:val=""/>
+      <w:lvlJc w:val="left"/>
+      <w:pPr>
+        <w:tabs>
+          <w:tab w:val="num" w:pos="6480"/>
+        </w:tabs>
+        <w:ind w:left="6480" w:hanging="360"/>
+      </w:pPr>
+      <w:rPr>
+        <w:rFonts w:ascii="Wingdings" w:hAnsi="Wingdings" w:hint="default"/>
+        <w:sz w:val="20"/>
+      </w:rPr>
+    </w:lvl>
+  </w:abstractNum>
+  <w:num w:numId="1" w16cid:durableId="762923413">
+    <w:abstractNumId w:val="0"/>
+  </w:num>
+</w:numbering>
 </file>
 
 <file path=word/styles.xml><?xml version="1.0" encoding="utf-8"?>

</xml_diff>

<commit_message>
feat: add FastAPI backend, model improvements, and React frontend
</commit_message>
<xml_diff>
--- a/myDocs/step.docx
+++ b/myDocs/step.docx
@@ -1215,6 +1215,169 @@
       </w:r>
     </w:p>
     <w:p/>
+    <w:p>
+      <w:pPr>
+        <w:rPr>
+          <w:b/>
+          <w:bCs/>
+        </w:rPr>
+      </w:pPr>
+      <w:r>
+        <w:rPr>
+          <w:b/>
+          <w:bCs/>
+        </w:rPr>
+        <w:t xml:space="preserve">STEP </w:t>
+      </w:r>
+      <w:proofErr w:type="gramStart"/>
+      <w:r>
+        <w:rPr>
+          <w:b/>
+          <w:bCs/>
+        </w:rPr>
+        <w:t>13</w:t>
+      </w:r>
+      <w:r>
+        <w:rPr>
+          <w:b/>
+          <w:bCs/>
+        </w:rPr>
+        <w:t xml:space="preserve"> :</w:t>
+      </w:r>
+      <w:proofErr w:type="gramEnd"/>
+    </w:p>
+    <w:p>
+      <w:pPr>
+        <w:ind w:left="720"/>
+      </w:pPr>
+      <w:r>
+        <w:tab/>
+      </w:r>
+      <w:r>
+        <w:t>$</w:t>
+      </w:r>
+      <w:proofErr w:type="spellStart"/>
+      <w:proofErr w:type="gramStart"/>
+      <w:r>
+        <w:t>env:PYTHONPATH</w:t>
+      </w:r>
+      <w:proofErr w:type="spellEnd"/>
+      <w:proofErr w:type="gramEnd"/>
+      <w:r>
+        <w:t>="</w:t>
+      </w:r>
+      <w:proofErr w:type="spellStart"/>
+      <w:r>
+        <w:t>src</w:t>
+      </w:r>
+      <w:proofErr w:type="spellEnd"/>
+      <w:r>
+        <w:t>;."</w:t>
+      </w:r>
+    </w:p>
+    <w:p>
+      <w:pPr>
+        <w:ind w:left="1440"/>
+      </w:pPr>
+      <w:proofErr w:type="spellStart"/>
+      <w:r>
+        <w:t>uvicorn</w:t>
+      </w:r>
+      <w:proofErr w:type="spellEnd"/>
+      <w:r>
+        <w:t xml:space="preserve"> </w:t>
+      </w:r>
+      <w:proofErr w:type="spellStart"/>
+      <w:r>
+        <w:t>app:app</w:t>
+      </w:r>
+      <w:proofErr w:type="spellEnd"/>
+      <w:r>
+        <w:t xml:space="preserve"> --reload</w:t>
+      </w:r>
+    </w:p>
+    <w:p>
+      <w:pPr>
+        <w:ind w:left="1440"/>
+      </w:pPr>
+      <w:r>
+        <w:rPr>
+          <w:i/>
+          <w:iCs/>
+        </w:rPr>
+        <w:t># terminal 2 — UI</w:t>
+      </w:r>
+    </w:p>
+    <w:p>
+      <w:pPr>
+        <w:ind w:left="1440"/>
+      </w:pPr>
+      <w:r>
+        <w:t>cd frontend</w:t>
+      </w:r>
+    </w:p>
+    <w:p>
+      <w:pPr>
+        <w:ind w:left="1440"/>
+      </w:pPr>
+      <w:proofErr w:type="spellStart"/>
+      <w:r>
+        <w:t>npm</w:t>
+      </w:r>
+      <w:proofErr w:type="spellEnd"/>
+      <w:r>
+        <w:t xml:space="preserve"> install</w:t>
+      </w:r>
+    </w:p>
+    <w:p>
+      <w:pPr>
+        <w:ind w:left="1440"/>
+      </w:pPr>
+      <w:proofErr w:type="spellStart"/>
+      <w:r>
+        <w:t>npm</w:t>
+      </w:r>
+      <w:proofErr w:type="spellEnd"/>
+      <w:r>
+        <w:t xml:space="preserve"> run dev</w:t>
+      </w:r>
+    </w:p>
+    <w:p>
+      <w:pPr>
+        <w:rPr>
+          <w:b/>
+          <w:bCs/>
+        </w:rPr>
+      </w:pPr>
+    </w:p>
+    <w:p>
+      <w:pPr>
+        <w:rPr>
+          <w:b/>
+          <w:bCs/>
+        </w:rPr>
+      </w:pPr>
+    </w:p>
+    <w:p>
+      <w:pPr>
+        <w:rPr>
+          <w:b/>
+          <w:bCs/>
+        </w:rPr>
+      </w:pPr>
+      <w:proofErr w:type="gramStart"/>
+      <w:r>
+        <w:rPr>
+          <w:b/>
+          <w:bCs/>
+        </w:rPr>
+        <w:t>high :</w:t>
+      </w:r>
+      <w:proofErr w:type="gramEnd"/>
+      <w:r>
+        <w:t>000000538236.jpg</w:t>
+      </w:r>
+    </w:p>
     <w:sectPr>
       <w:pgSz w:w="11906" w:h="16838"/>
       <w:pgMar w:top="1440" w:right="1440" w:bottom="1440" w:left="1440" w:header="708" w:footer="708" w:gutter="0"/>
@@ -1985,7 +2148,6 @@
   <w:style w:type="character" w:default="1" w:styleId="DefaultParagraphFont">
     <w:name w:val="Default Paragraph Font"/>
     <w:uiPriority w:val="1"/>
-    <w:semiHidden/>
     <w:unhideWhenUsed/>
   </w:style>
   <w:style w:type="table" w:default="1" w:styleId="TableNormal">

</xml_diff>